<commit_message>
feat: incorpora esquema de entrada v1 y alinea objetivos del TF
</commit_message>
<xml_diff>
--- a/proyecto/TF_Juan_Bautista_Xifro_2026.docx
+++ b/proyecto/TF_Juan_Bautista_Xifro_2026.docx
@@ -62,7 +62,7 @@
         <w:rPr>
           <w:sz w:val="38"/>
         </w:rPr>
-        <w:t>Evaluación de Modelos de Lenguaje de Gran Escala (LLMs) para Soporte al Cliente Automatizado: Un Framework basado en Big Data</w:t>
+        <w:t>Evaluación comparativa de modelos LLM con RAG para atención al cliente</w:t>
       </w:r>
     </w:p>
     <w:p>
@@ -100,7 +100,7 @@
           <w:i/>
           <w:iCs/>
         </w:rPr>
-        <w:t>Entrega Final</w:t>
+        <w:t>Segunda entrega</w:t>
       </w:r>
     </w:p>
     <w:p>
@@ -227,7 +227,7 @@
         <w:jc w:val="center"/>
       </w:pPr>
       <w:bookmarkStart w:id="0" w:name="_c0e28rqma0nq" w:colFirst="0" w:colLast="0"/>
-      <w:bookmarkStart w:id="1" w:name="_Toc242715151"/>
+      <w:bookmarkStart w:id="1" w:name="_Toc243143922"/>
       <w:bookmarkEnd w:id="0"/>
       <w:r>
         <w:lastRenderedPageBreak/>
@@ -259,7 +259,7 @@
       <w:r>
         <w:fldChar w:fldCharType="separate"/>
       </w:r>
-      <w:hyperlink w:anchor="_Toc242715151" w:history="1">
+      <w:hyperlink w:anchor="_Toc243143922" w:history="1">
         <w:r>
           <w:rPr>
             <w:rStyle w:val="Hipervnculo"/>
@@ -286,7 +286,7 @@
             <w:noProof/>
             <w:webHidden/>
           </w:rPr>
-          <w:instrText xml:space="preserve"> PAGEREF _Toc242715151 \h </w:instrText>
+          <w:instrText xml:space="preserve"> PAGEREF _Toc243143922 \h </w:instrText>
         </w:r>
         <w:r>
           <w:rPr>
@@ -330,7 +330,7 @@
           <w14:ligatures w14:val="standardContextual"/>
         </w:rPr>
       </w:pPr>
-      <w:hyperlink w:anchor="_Toc242715152" w:history="1">
+      <w:hyperlink w:anchor="_Toc243143923" w:history="1">
         <w:r>
           <w:rPr>
             <w:rStyle w:val="Hipervnculo"/>
@@ -357,7 +357,7 @@
             <w:noProof/>
             <w:webHidden/>
           </w:rPr>
-          <w:instrText xml:space="preserve"> PAGEREF _Toc242715152 \h </w:instrText>
+          <w:instrText xml:space="preserve"> PAGEREF _Toc243143923 \h </w:instrText>
         </w:r>
         <w:r>
           <w:rPr>
@@ -401,7 +401,7 @@
           <w14:ligatures w14:val="standardContextual"/>
         </w:rPr>
       </w:pPr>
-      <w:hyperlink w:anchor="_Toc242715153" w:history="1">
+      <w:hyperlink w:anchor="_Toc243143924" w:history="1">
         <w:r>
           <w:rPr>
             <w:rStyle w:val="Hipervnculo"/>
@@ -428,7 +428,7 @@
             <w:noProof/>
             <w:webHidden/>
           </w:rPr>
-          <w:instrText xml:space="preserve"> PAGEREF _Toc242715153 \h </w:instrText>
+          <w:instrText xml:space="preserve"> PAGEREF _Toc243143924 \h </w:instrText>
         </w:r>
         <w:r>
           <w:rPr>
@@ -472,7 +472,7 @@
           <w14:ligatures w14:val="standardContextual"/>
         </w:rPr>
       </w:pPr>
-      <w:hyperlink w:anchor="_Toc242715154" w:history="1">
+      <w:hyperlink w:anchor="_Toc243143925" w:history="1">
         <w:r>
           <w:rPr>
             <w:rStyle w:val="Hipervnculo"/>
@@ -499,7 +499,7 @@
             <w:noProof/>
             <w:webHidden/>
           </w:rPr>
-          <w:instrText xml:space="preserve"> PAGEREF _Toc242715154 \h </w:instrText>
+          <w:instrText xml:space="preserve"> PAGEREF _Toc243143925 \h </w:instrText>
         </w:r>
         <w:r>
           <w:rPr>
@@ -543,7 +543,7 @@
           <w14:ligatures w14:val="standardContextual"/>
         </w:rPr>
       </w:pPr>
-      <w:hyperlink w:anchor="_Toc242715155" w:history="1">
+      <w:hyperlink w:anchor="_Toc243143926" w:history="1">
         <w:r>
           <w:rPr>
             <w:rStyle w:val="Hipervnculo"/>
@@ -570,7 +570,7 @@
             <w:noProof/>
             <w:webHidden/>
           </w:rPr>
-          <w:instrText xml:space="preserve"> PAGEREF _Toc242715155 \h </w:instrText>
+          <w:instrText xml:space="preserve"> PAGEREF _Toc243143926 \h </w:instrText>
         </w:r>
         <w:r>
           <w:rPr>
@@ -614,7 +614,7 @@
           <w14:ligatures w14:val="standardContextual"/>
         </w:rPr>
       </w:pPr>
-      <w:hyperlink w:anchor="_Toc242715156" w:history="1">
+      <w:hyperlink w:anchor="_Toc243143927" w:history="1">
         <w:r>
           <w:rPr>
             <w:rStyle w:val="Hipervnculo"/>
@@ -641,7 +641,7 @@
             <w:noProof/>
             <w:webHidden/>
           </w:rPr>
-          <w:instrText xml:space="preserve"> PAGEREF _Toc242715156 \h </w:instrText>
+          <w:instrText xml:space="preserve"> PAGEREF _Toc243143927 \h </w:instrText>
         </w:r>
         <w:r>
           <w:rPr>
@@ -661,7 +661,7 @@
             <w:noProof/>
             <w:webHidden/>
           </w:rPr>
-          <w:t>9</w:t>
+          <w:t>8</w:t>
         </w:r>
         <w:r>
           <w:rPr>
@@ -685,7 +685,7 @@
           <w14:ligatures w14:val="standardContextual"/>
         </w:rPr>
       </w:pPr>
-      <w:hyperlink w:anchor="_Toc242715157" w:history="1">
+      <w:hyperlink w:anchor="_Toc243143928" w:history="1">
         <w:r>
           <w:rPr>
             <w:rStyle w:val="Hipervnculo"/>
@@ -712,7 +712,7 @@
             <w:noProof/>
             <w:webHidden/>
           </w:rPr>
-          <w:instrText xml:space="preserve"> PAGEREF _Toc242715157 \h </w:instrText>
+          <w:instrText xml:space="preserve"> PAGEREF _Toc243143928 \h </w:instrText>
         </w:r>
         <w:r>
           <w:rPr>
@@ -756,7 +756,7 @@
           <w14:ligatures w14:val="standardContextual"/>
         </w:rPr>
       </w:pPr>
-      <w:hyperlink w:anchor="_Toc242715158" w:history="1">
+      <w:hyperlink w:anchor="_Toc243143929" w:history="1">
         <w:r>
           <w:rPr>
             <w:rStyle w:val="Hipervnculo"/>
@@ -783,7 +783,7 @@
             <w:noProof/>
             <w:webHidden/>
           </w:rPr>
-          <w:instrText xml:space="preserve"> PAGEREF _Toc242715158 \h </w:instrText>
+          <w:instrText xml:space="preserve"> PAGEREF _Toc243143929 \h </w:instrText>
         </w:r>
         <w:r>
           <w:rPr>
@@ -827,7 +827,7 @@
           <w14:ligatures w14:val="standardContextual"/>
         </w:rPr>
       </w:pPr>
-      <w:hyperlink w:anchor="_Toc242715159" w:history="1">
+      <w:hyperlink w:anchor="_Toc243143930" w:history="1">
         <w:r>
           <w:rPr>
             <w:rStyle w:val="Hipervnculo"/>
@@ -854,7 +854,7 @@
             <w:noProof/>
             <w:webHidden/>
           </w:rPr>
-          <w:instrText xml:space="preserve"> PAGEREF _Toc242715159 \h </w:instrText>
+          <w:instrText xml:space="preserve"> PAGEREF _Toc243143930 \h </w:instrText>
         </w:r>
         <w:r>
           <w:rPr>
@@ -898,7 +898,7 @@
           <w14:ligatures w14:val="standardContextual"/>
         </w:rPr>
       </w:pPr>
-      <w:hyperlink w:anchor="_Toc242715160" w:history="1">
+      <w:hyperlink w:anchor="_Toc243143931" w:history="1">
         <w:r>
           <w:rPr>
             <w:rStyle w:val="Hipervnculo"/>
@@ -925,7 +925,7 @@
             <w:noProof/>
             <w:webHidden/>
           </w:rPr>
-          <w:instrText xml:space="preserve"> PAGEREF _Toc242715160 \h </w:instrText>
+          <w:instrText xml:space="preserve"> PAGEREF _Toc243143931 \h </w:instrText>
         </w:r>
         <w:r>
           <w:rPr>
@@ -969,7 +969,7 @@
           <w14:ligatures w14:val="standardContextual"/>
         </w:rPr>
       </w:pPr>
-      <w:hyperlink w:anchor="_Toc242715161" w:history="1">
+      <w:hyperlink w:anchor="_Toc243143932" w:history="1">
         <w:r>
           <w:rPr>
             <w:rStyle w:val="Hipervnculo"/>
@@ -996,7 +996,7 @@
             <w:noProof/>
             <w:webHidden/>
           </w:rPr>
-          <w:instrText xml:space="preserve"> PAGEREF _Toc242715161 \h </w:instrText>
+          <w:instrText xml:space="preserve"> PAGEREF _Toc243143932 \h </w:instrText>
         </w:r>
         <w:r>
           <w:rPr>
@@ -1040,7 +1040,7 @@
           <w14:ligatures w14:val="standardContextual"/>
         </w:rPr>
       </w:pPr>
-      <w:hyperlink w:anchor="_Toc242715162" w:history="1">
+      <w:hyperlink w:anchor="_Toc243143933" w:history="1">
         <w:r>
           <w:rPr>
             <w:rStyle w:val="Hipervnculo"/>
@@ -1067,7 +1067,7 @@
             <w:noProof/>
             <w:webHidden/>
           </w:rPr>
-          <w:instrText xml:space="preserve"> PAGEREF _Toc242715162 \h </w:instrText>
+          <w:instrText xml:space="preserve"> PAGEREF _Toc243143933 \h </w:instrText>
         </w:r>
         <w:r>
           <w:rPr>
@@ -1111,7 +1111,7 @@
           <w14:ligatures w14:val="standardContextual"/>
         </w:rPr>
       </w:pPr>
-      <w:hyperlink w:anchor="_Toc242715163" w:history="1">
+      <w:hyperlink w:anchor="_Toc243143934" w:history="1">
         <w:r>
           <w:rPr>
             <w:rStyle w:val="Hipervnculo"/>
@@ -1138,7 +1138,7 @@
             <w:noProof/>
             <w:webHidden/>
           </w:rPr>
-          <w:instrText xml:space="preserve"> PAGEREF _Toc242715163 \h </w:instrText>
+          <w:instrText xml:space="preserve"> PAGEREF _Toc243143934 \h </w:instrText>
         </w:r>
         <w:r>
           <w:rPr>
@@ -1182,7 +1182,7 @@
           <w14:ligatures w14:val="standardContextual"/>
         </w:rPr>
       </w:pPr>
-      <w:hyperlink w:anchor="_Toc242715164" w:history="1">
+      <w:hyperlink w:anchor="_Toc243143935" w:history="1">
         <w:r>
           <w:rPr>
             <w:rStyle w:val="Hipervnculo"/>
@@ -1209,7 +1209,7 @@
             <w:noProof/>
             <w:webHidden/>
           </w:rPr>
-          <w:instrText xml:space="preserve"> PAGEREF _Toc242715164 \h </w:instrText>
+          <w:instrText xml:space="preserve"> PAGEREF _Toc243143935 \h </w:instrText>
         </w:r>
         <w:r>
           <w:rPr>
@@ -1253,7 +1253,7 @@
           <w14:ligatures w14:val="standardContextual"/>
         </w:rPr>
       </w:pPr>
-      <w:hyperlink w:anchor="_Toc242715165" w:history="1">
+      <w:hyperlink w:anchor="_Toc243143936" w:history="1">
         <w:r>
           <w:rPr>
             <w:rStyle w:val="Hipervnculo"/>
@@ -1280,7 +1280,7 @@
             <w:noProof/>
             <w:webHidden/>
           </w:rPr>
-          <w:instrText xml:space="preserve"> PAGEREF _Toc242715165 \h </w:instrText>
+          <w:instrText xml:space="preserve"> PAGEREF _Toc243143936 \h </w:instrText>
         </w:r>
         <w:r>
           <w:rPr>
@@ -1300,7 +1300,7 @@
             <w:noProof/>
             <w:webHidden/>
           </w:rPr>
-          <w:t>13</w:t>
+          <w:t>14</w:t>
         </w:r>
         <w:r>
           <w:rPr>
@@ -1324,7 +1324,7 @@
           <w14:ligatures w14:val="standardContextual"/>
         </w:rPr>
       </w:pPr>
-      <w:hyperlink w:anchor="_Toc242715166" w:history="1">
+      <w:hyperlink w:anchor="_Toc243143937" w:history="1">
         <w:r>
           <w:rPr>
             <w:rStyle w:val="Hipervnculo"/>
@@ -1351,7 +1351,7 @@
             <w:noProof/>
             <w:webHidden/>
           </w:rPr>
-          <w:instrText xml:space="preserve"> PAGEREF _Toc242715166 \h </w:instrText>
+          <w:instrText xml:space="preserve"> PAGEREF _Toc243143937 \h </w:instrText>
         </w:r>
         <w:r>
           <w:rPr>
@@ -1371,7 +1371,7 @@
             <w:noProof/>
             <w:webHidden/>
           </w:rPr>
-          <w:t>13</w:t>
+          <w:t>14</w:t>
         </w:r>
         <w:r>
           <w:rPr>
@@ -1395,7 +1395,7 @@
           <w14:ligatures w14:val="standardContextual"/>
         </w:rPr>
       </w:pPr>
-      <w:hyperlink w:anchor="_Toc242715167" w:history="1">
+      <w:hyperlink w:anchor="_Toc243143938" w:history="1">
         <w:r>
           <w:rPr>
             <w:rStyle w:val="Hipervnculo"/>
@@ -1422,7 +1422,7 @@
             <w:noProof/>
             <w:webHidden/>
           </w:rPr>
-          <w:instrText xml:space="preserve"> PAGEREF _Toc242715167 \h </w:instrText>
+          <w:instrText xml:space="preserve"> PAGEREF _Toc243143938 \h </w:instrText>
         </w:r>
         <w:r>
           <w:rPr>
@@ -1442,7 +1442,7 @@
             <w:noProof/>
             <w:webHidden/>
           </w:rPr>
-          <w:t>14</w:t>
+          <w:t>15</w:t>
         </w:r>
         <w:r>
           <w:rPr>
@@ -1466,7 +1466,7 @@
           <w14:ligatures w14:val="standardContextual"/>
         </w:rPr>
       </w:pPr>
-      <w:hyperlink w:anchor="_Toc242715168" w:history="1">
+      <w:hyperlink w:anchor="_Toc243143939" w:history="1">
         <w:r>
           <w:rPr>
             <w:rStyle w:val="Hipervnculo"/>
@@ -1493,7 +1493,7 @@
             <w:noProof/>
             <w:webHidden/>
           </w:rPr>
-          <w:instrText xml:space="preserve"> PAGEREF _Toc242715168 \h </w:instrText>
+          <w:instrText xml:space="preserve"> PAGEREF _Toc243143939 \h </w:instrText>
         </w:r>
         <w:r>
           <w:rPr>
@@ -1513,7 +1513,7 @@
             <w:noProof/>
             <w:webHidden/>
           </w:rPr>
-          <w:t>15</w:t>
+          <w:t>16</w:t>
         </w:r>
         <w:r>
           <w:rPr>
@@ -1537,13 +1537,13 @@
           <w14:ligatures w14:val="standardContextual"/>
         </w:rPr>
       </w:pPr>
-      <w:hyperlink w:anchor="_Toc242715169" w:history="1">
+      <w:hyperlink w:anchor="_Toc243143940" w:history="1">
         <w:r>
           <w:rPr>
             <w:rStyle w:val="Hipervnculo"/>
             <w:noProof/>
           </w:rPr>
-          <w:t>2.4 Big Data aplicado al procesamiento de texto</w:t>
+          <w:t>2.4 Procesamiento reproducible de datos textuales</w:t>
         </w:r>
         <w:r>
           <w:rPr>
@@ -1564,7 +1564,7 @@
             <w:noProof/>
             <w:webHidden/>
           </w:rPr>
-          <w:instrText xml:space="preserve"> PAGEREF _Toc242715169 \h </w:instrText>
+          <w:instrText xml:space="preserve"> PAGEREF _Toc243143940 \h </w:instrText>
         </w:r>
         <w:r>
           <w:rPr>
@@ -1584,7 +1584,7 @@
             <w:noProof/>
             <w:webHidden/>
           </w:rPr>
-          <w:t>17</w:t>
+          <w:t>18</w:t>
         </w:r>
         <w:r>
           <w:rPr>
@@ -1608,7 +1608,7 @@
           <w14:ligatures w14:val="standardContextual"/>
         </w:rPr>
       </w:pPr>
-      <w:hyperlink w:anchor="_Toc242715170" w:history="1">
+      <w:hyperlink w:anchor="_Toc243143941" w:history="1">
         <w:r>
           <w:rPr>
             <w:rStyle w:val="Hipervnculo"/>
@@ -1635,7 +1635,7 @@
             <w:noProof/>
             <w:webHidden/>
           </w:rPr>
-          <w:instrText xml:space="preserve"> PAGEREF _Toc242715170 \h </w:instrText>
+          <w:instrText xml:space="preserve"> PAGEREF _Toc243143941 \h </w:instrText>
         </w:r>
         <w:r>
           <w:rPr>
@@ -1655,7 +1655,7 @@
             <w:noProof/>
             <w:webHidden/>
           </w:rPr>
-          <w:t>17</w:t>
+          <w:t>18</w:t>
         </w:r>
         <w:r>
           <w:rPr>
@@ -1679,7 +1679,7 @@
           <w14:ligatures w14:val="standardContextual"/>
         </w:rPr>
       </w:pPr>
-      <w:hyperlink w:anchor="_Toc242715171" w:history="1">
+      <w:hyperlink w:anchor="_Toc243143942" w:history="1">
         <w:r>
           <w:rPr>
             <w:rStyle w:val="Hipervnculo"/>
@@ -1706,7 +1706,7 @@
             <w:noProof/>
             <w:webHidden/>
           </w:rPr>
-          <w:instrText xml:space="preserve"> PAGEREF _Toc242715171 \h </w:instrText>
+          <w:instrText xml:space="preserve"> PAGEREF _Toc243143942 \h </w:instrText>
         </w:r>
         <w:r>
           <w:rPr>
@@ -1726,7 +1726,7 @@
             <w:noProof/>
             <w:webHidden/>
           </w:rPr>
-          <w:t>19</w:t>
+          <w:t>20</w:t>
         </w:r>
         <w:r>
           <w:rPr>
@@ -1750,7 +1750,7 @@
           <w14:ligatures w14:val="standardContextual"/>
         </w:rPr>
       </w:pPr>
-      <w:hyperlink w:anchor="_Toc242715172" w:history="1">
+      <w:hyperlink w:anchor="_Toc243143943" w:history="1">
         <w:r>
           <w:rPr>
             <w:rStyle w:val="Hipervnculo"/>
@@ -1777,7 +1777,7 @@
             <w:noProof/>
             <w:webHidden/>
           </w:rPr>
-          <w:instrText xml:space="preserve"> PAGEREF _Toc242715172 \h </w:instrText>
+          <w:instrText xml:space="preserve"> PAGEREF _Toc243143943 \h </w:instrText>
         </w:r>
         <w:r>
           <w:rPr>
@@ -1797,7 +1797,7 @@
             <w:noProof/>
             <w:webHidden/>
           </w:rPr>
-          <w:t>21</w:t>
+          <w:t>22</w:t>
         </w:r>
         <w:r>
           <w:rPr>
@@ -1821,21 +1821,13 @@
           <w14:ligatures w14:val="standardContextual"/>
         </w:rPr>
       </w:pPr>
-      <w:hyperlink w:anchor="_Toc242715173" w:history="1">
+      <w:hyperlink w:anchor="_Toc243143944" w:history="1">
         <w:r>
           <w:rPr>
             <w:rStyle w:val="Hipervnculo"/>
             <w:noProof/>
           </w:rPr>
-          <w:t>3.1 Paradigma y enfoque m</w:t>
-        </w:r>
-        <w:r>
-          <w:rPr>
-            <w:rStyle w:val="Hipervnculo"/>
-            <w:noProof/>
-          </w:rPr>
-          <w:lastRenderedPageBreak/>
-          <w:t>etodológico</w:t>
+          <w:t>3.1 Paradigma y enfoque metodológico</w:t>
         </w:r>
         <w:r>
           <w:rPr>
@@ -1856,7 +1848,7 @@
             <w:noProof/>
             <w:webHidden/>
           </w:rPr>
-          <w:instrText xml:space="preserve"> PAGEREF _Toc242715173 \h </w:instrText>
+          <w:instrText xml:space="preserve"> PAGEREF _Toc243143944 \h </w:instrText>
         </w:r>
         <w:r>
           <w:rPr>
@@ -1876,7 +1868,7 @@
             <w:noProof/>
             <w:webHidden/>
           </w:rPr>
-          <w:t>21</w:t>
+          <w:t>22</w:t>
         </w:r>
         <w:r>
           <w:rPr>
@@ -1900,7 +1892,7 @@
           <w14:ligatures w14:val="standardContextual"/>
         </w:rPr>
       </w:pPr>
-      <w:hyperlink w:anchor="_Toc242715174" w:history="1">
+      <w:hyperlink w:anchor="_Toc243143945" w:history="1">
         <w:r>
           <w:rPr>
             <w:rStyle w:val="Hipervnculo"/>
@@ -1927,7 +1919,7 @@
             <w:noProof/>
             <w:webHidden/>
           </w:rPr>
-          <w:instrText xml:space="preserve"> PAGEREF _Toc242715174 \h </w:instrText>
+          <w:instrText xml:space="preserve"> PAGEREF _Toc243143945 \h </w:instrText>
         </w:r>
         <w:r>
           <w:rPr>
@@ -1947,7 +1939,7 @@
             <w:noProof/>
             <w:webHidden/>
           </w:rPr>
-          <w:t>21</w:t>
+          <w:t>22</w:t>
         </w:r>
         <w:r>
           <w:rPr>
@@ -1971,7 +1963,7 @@
           <w14:ligatures w14:val="standardContextual"/>
         </w:rPr>
       </w:pPr>
-      <w:hyperlink w:anchor="_Toc242715175" w:history="1">
+      <w:hyperlink w:anchor="_Toc243143946" w:history="1">
         <w:r>
           <w:rPr>
             <w:rStyle w:val="Hipervnculo"/>
@@ -1998,7 +1990,7 @@
             <w:noProof/>
             <w:webHidden/>
           </w:rPr>
-          <w:instrText xml:space="preserve"> PAGEREF _Toc242715175 \h </w:instrText>
+          <w:instrText xml:space="preserve"> PAGEREF _Toc243143946 \h </w:instrText>
         </w:r>
         <w:r>
           <w:rPr>
@@ -2018,7 +2010,7 @@
             <w:noProof/>
             <w:webHidden/>
           </w:rPr>
-          <w:t>21</w:t>
+          <w:t>22</w:t>
         </w:r>
         <w:r>
           <w:rPr>
@@ -2042,7 +2034,7 @@
           <w14:ligatures w14:val="standardContextual"/>
         </w:rPr>
       </w:pPr>
-      <w:hyperlink w:anchor="_Toc242715176" w:history="1">
+      <w:hyperlink w:anchor="_Toc243143947" w:history="1">
         <w:r>
           <w:rPr>
             <w:rStyle w:val="Hipervnculo"/>
@@ -2069,7 +2061,7 @@
             <w:noProof/>
             <w:webHidden/>
           </w:rPr>
-          <w:instrText xml:space="preserve"> PAGEREF _Toc242715176 \h </w:instrText>
+          <w:instrText xml:space="preserve"> PAGEREF _Toc243143947 \h </w:instrText>
         </w:r>
         <w:r>
           <w:rPr>
@@ -2089,7 +2081,7 @@
             <w:noProof/>
             <w:webHidden/>
           </w:rPr>
-          <w:t>22</w:t>
+          <w:t>23</w:t>
         </w:r>
         <w:r>
           <w:rPr>
@@ -2113,7 +2105,7 @@
           <w14:ligatures w14:val="standardContextual"/>
         </w:rPr>
       </w:pPr>
-      <w:hyperlink w:anchor="_Toc242715177" w:history="1">
+      <w:hyperlink w:anchor="_Toc243143948" w:history="1">
         <w:r>
           <w:rPr>
             <w:rStyle w:val="Hipervnculo"/>
@@ -2140,7 +2132,7 @@
             <w:noProof/>
             <w:webHidden/>
           </w:rPr>
-          <w:instrText xml:space="preserve"> PAGEREF _Toc242715177 \h </w:instrText>
+          <w:instrText xml:space="preserve"> PAGEREF _Toc243143948 \h </w:instrText>
         </w:r>
         <w:r>
           <w:rPr>
@@ -2160,7 +2152,7 @@
             <w:noProof/>
             <w:webHidden/>
           </w:rPr>
-          <w:t>22</w:t>
+          <w:t>23</w:t>
         </w:r>
         <w:r>
           <w:rPr>
@@ -2184,7 +2176,7 @@
           <w14:ligatures w14:val="standardContextual"/>
         </w:rPr>
       </w:pPr>
-      <w:hyperlink w:anchor="_Toc242715178" w:history="1">
+      <w:hyperlink w:anchor="_Toc243143949" w:history="1">
         <w:r>
           <w:rPr>
             <w:rStyle w:val="Hipervnculo"/>
@@ -2211,7 +2203,7 @@
             <w:noProof/>
             <w:webHidden/>
           </w:rPr>
-          <w:instrText xml:space="preserve"> PAGEREF _Toc242715178 \h </w:instrText>
+          <w:instrText xml:space="preserve"> PAGEREF _Toc243143949 \h </w:instrText>
         </w:r>
         <w:r>
           <w:rPr>
@@ -2231,7 +2223,7 @@
             <w:noProof/>
             <w:webHidden/>
           </w:rPr>
-          <w:t>22</w:t>
+          <w:t>24</w:t>
         </w:r>
         <w:r>
           <w:rPr>
@@ -2255,7 +2247,7 @@
           <w14:ligatures w14:val="standardContextual"/>
         </w:rPr>
       </w:pPr>
-      <w:hyperlink w:anchor="_Toc242715179" w:history="1">
+      <w:hyperlink w:anchor="_Toc243143950" w:history="1">
         <w:r>
           <w:rPr>
             <w:rStyle w:val="Hipervnculo"/>
@@ -2282,7 +2274,7 @@
             <w:noProof/>
             <w:webHidden/>
           </w:rPr>
-          <w:instrText xml:space="preserve"> PAGEREF _Toc242715179 \h </w:instrText>
+          <w:instrText xml:space="preserve"> PAGEREF _Toc243143950 \h </w:instrText>
         </w:r>
         <w:r>
           <w:rPr>
@@ -2302,7 +2294,7 @@
             <w:noProof/>
             <w:webHidden/>
           </w:rPr>
-          <w:t>23</w:t>
+          <w:t>24</w:t>
         </w:r>
         <w:r>
           <w:rPr>
@@ -2326,7 +2318,7 @@
           <w14:ligatures w14:val="standardContextual"/>
         </w:rPr>
       </w:pPr>
-      <w:hyperlink w:anchor="_Toc242715180" w:history="1">
+      <w:hyperlink w:anchor="_Toc243143951" w:history="1">
         <w:r>
           <w:rPr>
             <w:rStyle w:val="Hipervnculo"/>
@@ -2353,7 +2345,7 @@
             <w:noProof/>
             <w:webHidden/>
           </w:rPr>
-          <w:instrText xml:space="preserve"> PAGEREF _Toc242715180 \h </w:instrText>
+          <w:instrText xml:space="preserve"> PAGEREF _Toc243143951 \h </w:instrText>
         </w:r>
         <w:r>
           <w:rPr>
@@ -2373,7 +2365,7 @@
             <w:noProof/>
             <w:webHidden/>
           </w:rPr>
-          <w:t>23</w:t>
+          <w:t>24</w:t>
         </w:r>
         <w:r>
           <w:rPr>
@@ -2397,7 +2389,7 @@
           <w14:ligatures w14:val="standardContextual"/>
         </w:rPr>
       </w:pPr>
-      <w:hyperlink w:anchor="_Toc242715181" w:history="1">
+      <w:hyperlink w:anchor="_Toc243143952" w:history="1">
         <w:r>
           <w:rPr>
             <w:rStyle w:val="Hipervnculo"/>
@@ -2424,7 +2416,7 @@
             <w:noProof/>
             <w:webHidden/>
           </w:rPr>
-          <w:instrText xml:space="preserve"> PAGEREF _Toc242715181 \h </w:instrText>
+          <w:instrText xml:space="preserve"> PAGEREF _Toc243143952 \h </w:instrText>
         </w:r>
         <w:r>
           <w:rPr>
@@ -2444,7 +2436,7 @@
             <w:noProof/>
             <w:webHidden/>
           </w:rPr>
-          <w:t>25</w:t>
+          <w:t>26</w:t>
         </w:r>
         <w:r>
           <w:rPr>
@@ -2468,7 +2460,7 @@
           <w14:ligatures w14:val="standardContextual"/>
         </w:rPr>
       </w:pPr>
-      <w:hyperlink w:anchor="_Toc242715182" w:history="1">
+      <w:hyperlink w:anchor="_Toc243143953" w:history="1">
         <w:r>
           <w:rPr>
             <w:rStyle w:val="Hipervnculo"/>
@@ -2495,7 +2487,7 @@
             <w:noProof/>
             <w:webHidden/>
           </w:rPr>
-          <w:instrText xml:space="preserve"> PAGEREF _Toc242715182 \h </w:instrText>
+          <w:instrText xml:space="preserve"> PAGEREF _Toc243143953 \h </w:instrText>
         </w:r>
         <w:r>
           <w:rPr>
@@ -2515,7 +2507,7 @@
             <w:noProof/>
             <w:webHidden/>
           </w:rPr>
-          <w:t>25</w:t>
+          <w:t>26</w:t>
         </w:r>
         <w:r>
           <w:rPr>
@@ -2539,7 +2531,7 @@
           <w14:ligatures w14:val="standardContextual"/>
         </w:rPr>
       </w:pPr>
-      <w:hyperlink w:anchor="_Toc242715183" w:history="1">
+      <w:hyperlink w:anchor="_Toc243143954" w:history="1">
         <w:r>
           <w:rPr>
             <w:rStyle w:val="Hipervnculo"/>
@@ -2566,7 +2558,7 @@
             <w:noProof/>
             <w:webHidden/>
           </w:rPr>
-          <w:instrText xml:space="preserve"> PAGEREF _Toc242715183 \h </w:instrText>
+          <w:instrText xml:space="preserve"> PAGEREF _Toc243143954 \h </w:instrText>
         </w:r>
         <w:r>
           <w:rPr>
@@ -2586,7 +2578,7 @@
             <w:noProof/>
             <w:webHidden/>
           </w:rPr>
-          <w:t>25</w:t>
+          <w:t>26</w:t>
         </w:r>
         <w:r>
           <w:rPr>
@@ -2610,7 +2602,7 @@
           <w14:ligatures w14:val="standardContextual"/>
         </w:rPr>
       </w:pPr>
-      <w:hyperlink w:anchor="_Toc242715184" w:history="1">
+      <w:hyperlink w:anchor="_Toc243143955" w:history="1">
         <w:r>
           <w:rPr>
             <w:rStyle w:val="Hipervnculo"/>
@@ -2637,7 +2629,7 @@
             <w:noProof/>
             <w:webHidden/>
           </w:rPr>
-          <w:instrText xml:space="preserve"> PAGEREF _Toc242715184 \h </w:instrText>
+          <w:instrText xml:space="preserve"> PAGEREF _Toc243143955 \h </w:instrText>
         </w:r>
         <w:r>
           <w:rPr>
@@ -2657,7 +2649,7 @@
             <w:noProof/>
             <w:webHidden/>
           </w:rPr>
-          <w:t>25</w:t>
+          <w:t>26</w:t>
         </w:r>
         <w:r>
           <w:rPr>
@@ -2681,7 +2673,7 @@
           <w14:ligatures w14:val="standardContextual"/>
         </w:rPr>
       </w:pPr>
-      <w:hyperlink w:anchor="_Toc242715185" w:history="1">
+      <w:hyperlink w:anchor="_Toc243143956" w:history="1">
         <w:r>
           <w:rPr>
             <w:rStyle w:val="Hipervnculo"/>
@@ -2708,7 +2700,7 @@
             <w:noProof/>
             <w:webHidden/>
           </w:rPr>
-          <w:instrText xml:space="preserve"> PAGEREF _Toc242715185 \h </w:instrText>
+          <w:instrText xml:space="preserve"> PAGEREF _Toc243143956 \h </w:instrText>
         </w:r>
         <w:r>
           <w:rPr>
@@ -2728,7 +2720,7 @@
             <w:noProof/>
             <w:webHidden/>
           </w:rPr>
-          <w:t>25</w:t>
+          <w:t>26</w:t>
         </w:r>
         <w:r>
           <w:rPr>
@@ -2752,7 +2744,7 @@
           <w14:ligatures w14:val="standardContextual"/>
         </w:rPr>
       </w:pPr>
-      <w:hyperlink w:anchor="_Toc242715186" w:history="1">
+      <w:hyperlink w:anchor="_Toc243143957" w:history="1">
         <w:r>
           <w:rPr>
             <w:rStyle w:val="Hipervnculo"/>
@@ -2779,7 +2771,7 @@
             <w:noProof/>
             <w:webHidden/>
           </w:rPr>
-          <w:instrText xml:space="preserve"> PAGEREF _Toc242715186 \h </w:instrText>
+          <w:instrText xml:space="preserve"> PAGEREF _Toc243143957 \h </w:instrText>
         </w:r>
         <w:r>
           <w:rPr>
@@ -2799,7 +2791,7 @@
             <w:noProof/>
             <w:webHidden/>
           </w:rPr>
-          <w:t>26</w:t>
+          <w:t>27</w:t>
         </w:r>
         <w:r>
           <w:rPr>
@@ -2823,7 +2815,7 @@
           <w14:ligatures w14:val="standardContextual"/>
         </w:rPr>
       </w:pPr>
-      <w:hyperlink w:anchor="_Toc242715187" w:history="1">
+      <w:hyperlink w:anchor="_Toc243143958" w:history="1">
         <w:r>
           <w:rPr>
             <w:rStyle w:val="Hipervnculo"/>
@@ -2850,7 +2842,7 @@
             <w:noProof/>
             <w:webHidden/>
           </w:rPr>
-          <w:instrText xml:space="preserve"> PAGEREF _Toc242715187 \h </w:instrText>
+          <w:instrText xml:space="preserve"> PAGEREF _Toc243143958 \h </w:instrText>
         </w:r>
         <w:r>
           <w:rPr>
@@ -2870,7 +2862,7 @@
             <w:noProof/>
             <w:webHidden/>
           </w:rPr>
-          <w:t>27</w:t>
+          <w:t>28</w:t>
         </w:r>
         <w:r>
           <w:rPr>
@@ -2894,7 +2886,7 @@
           <w14:ligatures w14:val="standardContextual"/>
         </w:rPr>
       </w:pPr>
-      <w:hyperlink w:anchor="_Toc242715188" w:history="1">
+      <w:hyperlink w:anchor="_Toc243143959" w:history="1">
         <w:r>
           <w:rPr>
             <w:rStyle w:val="Hipervnculo"/>
@@ -2921,7 +2913,7 @@
             <w:noProof/>
             <w:webHidden/>
           </w:rPr>
-          <w:instrText xml:space="preserve"> PAGEREF _Toc242715188 \h </w:instrText>
+          <w:instrText xml:space="preserve"> PAGEREF _Toc243143959 \h </w:instrText>
         </w:r>
         <w:r>
           <w:rPr>
@@ -2941,7 +2933,7 @@
             <w:noProof/>
             <w:webHidden/>
           </w:rPr>
-          <w:t>27</w:t>
+          <w:t>28</w:t>
         </w:r>
         <w:r>
           <w:rPr>
@@ -2965,7 +2957,7 @@
           <w14:ligatures w14:val="standardContextual"/>
         </w:rPr>
       </w:pPr>
-      <w:hyperlink w:anchor="_Toc242715189" w:history="1">
+      <w:hyperlink w:anchor="_Toc243143960" w:history="1">
         <w:r>
           <w:rPr>
             <w:rStyle w:val="Hipervnculo"/>
@@ -2992,7 +2984,7 @@
             <w:noProof/>
             <w:webHidden/>
           </w:rPr>
-          <w:instrText xml:space="preserve"> PAGEREF _Toc242715189 \h </w:instrText>
+          <w:instrText xml:space="preserve"> PAGEREF _Toc243143960 \h </w:instrText>
         </w:r>
         <w:r>
           <w:rPr>
@@ -3012,7 +3004,7 @@
             <w:noProof/>
             <w:webHidden/>
           </w:rPr>
-          <w:t>27</w:t>
+          <w:t>28</w:t>
         </w:r>
         <w:r>
           <w:rPr>
@@ -3036,7 +3028,7 @@
           <w14:ligatures w14:val="standardContextual"/>
         </w:rPr>
       </w:pPr>
-      <w:hyperlink w:anchor="_Toc242715190" w:history="1">
+      <w:hyperlink w:anchor="_Toc243143961" w:history="1">
         <w:r>
           <w:rPr>
             <w:rStyle w:val="Hipervnculo"/>
@@ -3063,7 +3055,7 @@
             <w:noProof/>
             <w:webHidden/>
           </w:rPr>
-          <w:instrText xml:space="preserve"> PAGEREF _Toc242715190 \h </w:instrText>
+          <w:instrText xml:space="preserve"> PAGEREF _Toc243143961 \h </w:instrText>
         </w:r>
         <w:r>
           <w:rPr>
@@ -3083,7 +3075,7 @@
             <w:noProof/>
             <w:webHidden/>
           </w:rPr>
-          <w:t>27</w:t>
+          <w:t>28</w:t>
         </w:r>
         <w:r>
           <w:rPr>
@@ -3107,7 +3099,7 @@
           <w14:ligatures w14:val="standardContextual"/>
         </w:rPr>
       </w:pPr>
-      <w:hyperlink w:anchor="_Toc242715191" w:history="1">
+      <w:hyperlink w:anchor="_Toc243143962" w:history="1">
         <w:r>
           <w:rPr>
             <w:rStyle w:val="Hipervnculo"/>
@@ -3134,7 +3126,7 @@
             <w:noProof/>
             <w:webHidden/>
           </w:rPr>
-          <w:instrText xml:space="preserve"> PAGEREF _Toc242715191 \h </w:instrText>
+          <w:instrText xml:space="preserve"> PAGEREF _Toc243143962 \h </w:instrText>
         </w:r>
         <w:r>
           <w:rPr>
@@ -3154,7 +3146,7 @@
             <w:noProof/>
             <w:webHidden/>
           </w:rPr>
-          <w:t>27</w:t>
+          <w:t>29</w:t>
         </w:r>
         <w:r>
           <w:rPr>
@@ -3178,7 +3170,7 @@
           <w14:ligatures w14:val="standardContextual"/>
         </w:rPr>
       </w:pPr>
-      <w:hyperlink w:anchor="_Toc242715192" w:history="1">
+      <w:hyperlink w:anchor="_Toc243143963" w:history="1">
         <w:r>
           <w:rPr>
             <w:rStyle w:val="Hipervnculo"/>
@@ -3205,7 +3197,7 @@
             <w:noProof/>
             <w:webHidden/>
           </w:rPr>
-          <w:instrText xml:space="preserve"> PAGEREF _Toc242715192 \h </w:instrText>
+          <w:instrText xml:space="preserve"> PAGEREF _Toc243143963 \h </w:instrText>
         </w:r>
         <w:r>
           <w:rPr>
@@ -3225,7 +3217,7 @@
             <w:noProof/>
             <w:webHidden/>
           </w:rPr>
-          <w:t>28</w:t>
+          <w:t>29</w:t>
         </w:r>
         <w:r>
           <w:rPr>
@@ -3249,7 +3241,7 @@
           <w14:ligatures w14:val="standardContextual"/>
         </w:rPr>
       </w:pPr>
-      <w:hyperlink w:anchor="_Toc242715193" w:history="1">
+      <w:hyperlink w:anchor="_Toc243143964" w:history="1">
         <w:r>
           <w:rPr>
             <w:rStyle w:val="Hipervnculo"/>
@@ -3276,7 +3268,7 @@
             <w:noProof/>
             <w:webHidden/>
           </w:rPr>
-          <w:instrText xml:space="preserve"> PAGEREF _Toc242715193 \h </w:instrText>
+          <w:instrText xml:space="preserve"> PAGEREF _Toc243143964 \h </w:instrText>
         </w:r>
         <w:r>
           <w:rPr>
@@ -3296,7 +3288,7 @@
             <w:noProof/>
             <w:webHidden/>
           </w:rPr>
-          <w:t>29</w:t>
+          <w:t>30</w:t>
         </w:r>
         <w:r>
           <w:rPr>
@@ -3320,7 +3312,7 @@
           <w14:ligatures w14:val="standardContextual"/>
         </w:rPr>
       </w:pPr>
-      <w:hyperlink w:anchor="_Toc242715194" w:history="1">
+      <w:hyperlink w:anchor="_Toc243143965" w:history="1">
         <w:r>
           <w:rPr>
             <w:rStyle w:val="Hipervnculo"/>
@@ -3347,7 +3339,7 @@
             <w:noProof/>
             <w:webHidden/>
           </w:rPr>
-          <w:instrText xml:space="preserve"> PAGEREF _Toc242715194 \h </w:instrText>
+          <w:instrText xml:space="preserve"> PAGEREF _Toc243143965 \h </w:instrText>
         </w:r>
         <w:r>
           <w:rPr>
@@ -3367,7 +3359,7 @@
             <w:noProof/>
             <w:webHidden/>
           </w:rPr>
-          <w:t>29</w:t>
+          <w:t>30</w:t>
         </w:r>
         <w:r>
           <w:rPr>
@@ -3391,7 +3383,7 @@
           <w14:ligatures w14:val="standardContextual"/>
         </w:rPr>
       </w:pPr>
-      <w:hyperlink w:anchor="_Toc242715195" w:history="1">
+      <w:hyperlink w:anchor="_Toc243143966" w:history="1">
         <w:r>
           <w:rPr>
             <w:rStyle w:val="Hipervnculo"/>
@@ -3418,7 +3410,7 @@
             <w:noProof/>
             <w:webHidden/>
           </w:rPr>
-          <w:instrText xml:space="preserve"> PAGEREF _Toc242715195 \h </w:instrText>
+          <w:instrText xml:space="preserve"> PAGEREF _Toc243143966 \h </w:instrText>
         </w:r>
         <w:r>
           <w:rPr>
@@ -3438,7 +3430,7 @@
             <w:noProof/>
             <w:webHidden/>
           </w:rPr>
-          <w:t>29</w:t>
+          <w:t>30</w:t>
         </w:r>
         <w:r>
           <w:rPr>
@@ -3462,7 +3454,7 @@
           <w14:ligatures w14:val="standardContextual"/>
         </w:rPr>
       </w:pPr>
-      <w:hyperlink w:anchor="_Toc242715196" w:history="1">
+      <w:hyperlink w:anchor="_Toc243143967" w:history="1">
         <w:r>
           <w:rPr>
             <w:rStyle w:val="Hipervnculo"/>
@@ -3489,7 +3481,7 @@
             <w:noProof/>
             <w:webHidden/>
           </w:rPr>
-          <w:instrText xml:space="preserve"> PAGEREF _Toc242715196 \h </w:instrText>
+          <w:instrText xml:space="preserve"> PAGEREF _Toc243143967 \h </w:instrText>
         </w:r>
         <w:r>
           <w:rPr>
@@ -3509,7 +3501,7 @@
             <w:noProof/>
             <w:webHidden/>
           </w:rPr>
-          <w:t>29</w:t>
+          <w:t>30</w:t>
         </w:r>
         <w:r>
           <w:rPr>
@@ -3533,7 +3525,7 @@
           <w14:ligatures w14:val="standardContextual"/>
         </w:rPr>
       </w:pPr>
-      <w:hyperlink w:anchor="_Toc242715197" w:history="1">
+      <w:hyperlink w:anchor="_Toc243143968" w:history="1">
         <w:r>
           <w:rPr>
             <w:rStyle w:val="Hipervnculo"/>
@@ -3560,7 +3552,7 @@
             <w:noProof/>
             <w:webHidden/>
           </w:rPr>
-          <w:instrText xml:space="preserve"> PAGEREF _Toc242715197 \h </w:instrText>
+          <w:instrText xml:space="preserve"> PAGEREF _Toc243143968 \h </w:instrText>
         </w:r>
         <w:r>
           <w:rPr>
@@ -3580,7 +3572,7 @@
             <w:noProof/>
             <w:webHidden/>
           </w:rPr>
-          <w:t>30</w:t>
+          <w:t>31</w:t>
         </w:r>
         <w:r>
           <w:rPr>
@@ -3604,7 +3596,7 @@
           <w14:ligatures w14:val="standardContextual"/>
         </w:rPr>
       </w:pPr>
-      <w:hyperlink w:anchor="_Toc242715198" w:history="1">
+      <w:hyperlink w:anchor="_Toc243143969" w:history="1">
         <w:r>
           <w:rPr>
             <w:rStyle w:val="Hipervnculo"/>
@@ -3631,7 +3623,7 @@
             <w:noProof/>
             <w:webHidden/>
           </w:rPr>
-          <w:instrText xml:space="preserve"> PAGEREF _Toc242715198 \h </w:instrText>
+          <w:instrText xml:space="preserve"> PAGEREF _Toc243143969 \h </w:instrText>
         </w:r>
         <w:r>
           <w:rPr>
@@ -3651,7 +3643,7 @@
             <w:noProof/>
             <w:webHidden/>
           </w:rPr>
-          <w:t>31</w:t>
+          <w:t>32</w:t>
         </w:r>
         <w:r>
           <w:rPr>
@@ -3675,7 +3667,7 @@
           <w14:ligatures w14:val="standardContextual"/>
         </w:rPr>
       </w:pPr>
-      <w:hyperlink w:anchor="_Toc242715199" w:history="1">
+      <w:hyperlink w:anchor="_Toc243143970" w:history="1">
         <w:r>
           <w:rPr>
             <w:rStyle w:val="Hipervnculo"/>
@@ -3702,7 +3694,7 @@
             <w:noProof/>
             <w:webHidden/>
           </w:rPr>
-          <w:instrText xml:space="preserve"> PAGEREF _Toc242715199 \h </w:instrText>
+          <w:instrText xml:space="preserve"> PAGEREF _Toc243143970 \h </w:instrText>
         </w:r>
         <w:r>
           <w:rPr>
@@ -3722,7 +3714,7 @@
             <w:noProof/>
             <w:webHidden/>
           </w:rPr>
-          <w:t>31</w:t>
+          <w:t>32</w:t>
         </w:r>
         <w:r>
           <w:rPr>
@@ -3746,7 +3738,7 @@
           <w14:ligatures w14:val="standardContextual"/>
         </w:rPr>
       </w:pPr>
-      <w:hyperlink w:anchor="_Toc242715200" w:history="1">
+      <w:hyperlink w:anchor="_Toc243143971" w:history="1">
         <w:r>
           <w:rPr>
             <w:rStyle w:val="Hipervnculo"/>
@@ -3773,7 +3765,7 @@
             <w:noProof/>
             <w:webHidden/>
           </w:rPr>
-          <w:instrText xml:space="preserve"> PAGEREF _Toc242715200 \h </w:instrText>
+          <w:instrText xml:space="preserve"> PAGEREF _Toc243143971 \h </w:instrText>
         </w:r>
         <w:r>
           <w:rPr>
@@ -3793,7 +3785,7 @@
             <w:noProof/>
             <w:webHidden/>
           </w:rPr>
-          <w:t>31</w:t>
+          <w:t>32</w:t>
         </w:r>
         <w:r>
           <w:rPr>
@@ -3817,7 +3809,7 @@
           <w14:ligatures w14:val="standardContextual"/>
         </w:rPr>
       </w:pPr>
-      <w:hyperlink w:anchor="_Toc242715201" w:history="1">
+      <w:hyperlink w:anchor="_Toc243143972" w:history="1">
         <w:r>
           <w:rPr>
             <w:rStyle w:val="Hipervnculo"/>
@@ -3844,7 +3836,7 @@
             <w:noProof/>
             <w:webHidden/>
           </w:rPr>
-          <w:instrText xml:space="preserve"> PAGEREF _Toc242715201 \h </w:instrText>
+          <w:instrText xml:space="preserve"> PAGEREF _Toc243143972 \h </w:instrText>
         </w:r>
         <w:r>
           <w:rPr>
@@ -3864,7 +3856,7 @@
             <w:noProof/>
             <w:webHidden/>
           </w:rPr>
-          <w:t>32</w:t>
+          <w:t>33</w:t>
         </w:r>
         <w:r>
           <w:rPr>
@@ -3888,7 +3880,7 @@
           <w14:ligatures w14:val="standardContextual"/>
         </w:rPr>
       </w:pPr>
-      <w:hyperlink w:anchor="_Toc242715202" w:history="1">
+      <w:hyperlink w:anchor="_Toc243143973" w:history="1">
         <w:r>
           <w:rPr>
             <w:rStyle w:val="Hipervnculo"/>
@@ -3915,7 +3907,7 @@
             <w:noProof/>
             <w:webHidden/>
           </w:rPr>
-          <w:instrText xml:space="preserve"> PAGEREF _Toc242715202 \h </w:instrText>
+          <w:instrText xml:space="preserve"> PAGEREF _Toc243143973 \h </w:instrText>
         </w:r>
         <w:r>
           <w:rPr>
@@ -3935,7 +3927,7 @@
             <w:noProof/>
             <w:webHidden/>
           </w:rPr>
-          <w:t>40</w:t>
+          <w:t>41</w:t>
         </w:r>
         <w:r>
           <w:rPr>
@@ -3959,7 +3951,7 @@
           <w14:ligatures w14:val="standardContextual"/>
         </w:rPr>
       </w:pPr>
-      <w:hyperlink w:anchor="_Toc242715203" w:history="1">
+      <w:hyperlink w:anchor="_Toc243143974" w:history="1">
         <w:r>
           <w:rPr>
             <w:rStyle w:val="Hipervnculo"/>
@@ -3986,7 +3978,7 @@
             <w:noProof/>
             <w:webHidden/>
           </w:rPr>
-          <w:instrText xml:space="preserve"> PAGEREF _Toc242715203 \h </w:instrText>
+          <w:instrText xml:space="preserve"> PAGEREF _Toc243143974 \h </w:instrText>
         </w:r>
         <w:r>
           <w:rPr>
@@ -4006,7 +3998,7 @@
             <w:noProof/>
             <w:webHidden/>
           </w:rPr>
-          <w:t>41</w:t>
+          <w:t>42</w:t>
         </w:r>
         <w:r>
           <w:rPr>
@@ -4030,7 +4022,7 @@
           <w14:ligatures w14:val="standardContextual"/>
         </w:rPr>
       </w:pPr>
-      <w:hyperlink w:anchor="_Toc242715204" w:history="1">
+      <w:hyperlink w:anchor="_Toc243143975" w:history="1">
         <w:r>
           <w:rPr>
             <w:rStyle w:val="Hipervnculo"/>
@@ -4057,7 +4049,7 @@
             <w:noProof/>
             <w:webHidden/>
           </w:rPr>
-          <w:instrText xml:space="preserve"> PAGEREF _Toc242715204 \h </w:instrText>
+          <w:instrText xml:space="preserve"> PAGEREF _Toc243143975 \h </w:instrText>
         </w:r>
         <w:r>
           <w:rPr>
@@ -4077,7 +4069,7 @@
             <w:noProof/>
             <w:webHidden/>
           </w:rPr>
-          <w:t>42</w:t>
+          <w:t>43</w:t>
         </w:r>
         <w:r>
           <w:rPr>
@@ -4101,7 +4093,7 @@
           <w14:ligatures w14:val="standardContextual"/>
         </w:rPr>
       </w:pPr>
-      <w:hyperlink w:anchor="_Toc242715205" w:history="1">
+      <w:hyperlink w:anchor="_Toc243143976" w:history="1">
         <w:r>
           <w:rPr>
             <w:rStyle w:val="Hipervnculo"/>
@@ -4128,7 +4120,7 @@
             <w:noProof/>
             <w:webHidden/>
           </w:rPr>
-          <w:instrText xml:space="preserve"> PAGEREF _Toc242715205 \h </w:instrText>
+          <w:instrText xml:space="preserve"> PAGEREF _Toc243143976 \h </w:instrText>
         </w:r>
         <w:r>
           <w:rPr>
@@ -4148,7 +4140,7 @@
             <w:noProof/>
             <w:webHidden/>
           </w:rPr>
-          <w:t>45</w:t>
+          <w:t>46</w:t>
         </w:r>
         <w:r>
           <w:rPr>
@@ -4174,6 +4166,7 @@
           <w:color w:val="2E75B6"/>
           <w:sz w:val="36"/>
         </w:rPr>
+        <w:lastRenderedPageBreak/>
         <w:t>Índice de tablas</w:t>
       </w:r>
     </w:p>
@@ -4186,10 +4179,11 @@
       </w:pPr>
       <w:r>
         <w:t>Tabla 1. Parámetros de costo utilizados en el piloto</w:t>
+      </w:r>
+      <w:r>
         <w:tab/>
         <w:t>27</w:t>
       </w:r>
-      <w:r/>
     </w:p>
     <w:p>
       <w:pPr>
@@ -4200,10 +4194,11 @@
       </w:pPr>
       <w:r>
         <w:t>Tabla 2. Auditoría y desempeño de recuperación del piloto</w:t>
+      </w:r>
+      <w:r>
         <w:tab/>
         <w:t>30</w:t>
       </w:r>
-      <w:r/>
     </w:p>
     <w:p>
       <w:pPr>
@@ -4214,10 +4209,11 @@
       </w:pPr>
       <w:r>
         <w:t>Tabla 3. Calidad semántica en la comparación controlada del piloto</w:t>
+      </w:r>
+      <w:r>
         <w:tab/>
         <w:t>31</w:t>
       </w:r>
-      <w:r/>
     </w:p>
     <w:p>
       <w:pPr>
@@ -4228,10 +4224,11 @@
       </w:pPr>
       <w:r>
         <w:t>Tabla 4. Eficiencia operativa en la comparación controlada del piloto</w:t>
+      </w:r>
+      <w:r>
         <w:tab/>
         <w:t>31</w:t>
       </w:r>
-      <w:r/>
     </w:p>
     <w:p>
       <w:pPr>
@@ -4242,10 +4239,11 @@
       </w:pPr>
       <w:r>
         <w:t>Tabla 5. Calidad media del piloto según Hit@3</w:t>
+      </w:r>
+      <w:r>
         <w:tab/>
         <w:t>32</w:t>
       </w:r>
-      <w:r/>
     </w:p>
     <w:p>
       <w:pPr>
@@ -4256,10 +4254,11 @@
       </w:pPr>
       <w:r>
         <w:t>Tabla 6. Resultados agregados del experimento ampliado en la condición RAG</w:t>
+      </w:r>
+      <w:r>
         <w:tab/>
         <w:t>35</w:t>
       </w:r>
-      <w:r/>
     </w:p>
     <w:p>
       <w:pPr>
@@ -4271,6 +4270,7 @@
           <w:color w:val="2E75B6"/>
           <w:sz w:val="36"/>
         </w:rPr>
+        <w:lastRenderedPageBreak/>
         <w:t>Índice de figuras</w:t>
       </w:r>
     </w:p>
@@ -4283,10 +4283,11 @@
       </w:pPr>
       <w:r>
         <w:t>Figura 1. Dashboard del experimento ampliado</w:t>
+      </w:r>
+      <w:r>
         <w:tab/>
         <w:t>38</w:t>
       </w:r>
-      <w:r/>
     </w:p>
     <w:p>
       <w:pPr>
@@ -4297,10 +4298,11 @@
       </w:pPr>
       <w:r>
         <w:t>Figura 2. Calidad automática por modelo y condición</w:t>
+      </w:r>
+      <w:r>
         <w:tab/>
         <w:t>39</w:t>
       </w:r>
-      <w:r/>
     </w:p>
     <w:p>
       <w:pPr>
@@ -4311,10 +4313,11 @@
       </w:pPr>
       <w:r>
         <w:t>Figura 3. Relación entre latencia, costo y calidad en la condición RAG</w:t>
+      </w:r>
+      <w:r>
         <w:tab/>
         <w:t>40</w:t>
       </w:r>
-      <w:r/>
     </w:p>
     <w:p>
       <w:pPr>
@@ -4323,8 +4326,9 @@
         <w:spacing w:before="400" w:after="200"/>
         <w:jc w:val="center"/>
       </w:pPr>
-      <w:bookmarkStart w:id="3" w:name="_Toc242715152"/>
-      <w:r>
+      <w:bookmarkStart w:id="3" w:name="_Toc243143923"/>
+      <w:r>
+        <w:lastRenderedPageBreak/>
         <w:t>Resumen</w:t>
       </w:r>
       <w:bookmarkEnd w:id="3"/>
@@ -4362,8 +4366,9 @@
         <w:spacing w:before="400" w:after="200"/>
         <w:jc w:val="center"/>
       </w:pPr>
-      <w:bookmarkStart w:id="5" w:name="_Toc242715153"/>
-      <w:r>
+      <w:bookmarkStart w:id="5" w:name="_Toc243143924"/>
+      <w:r>
+        <w:lastRenderedPageBreak/>
         <w:t>Capítulo 1 - Introducción</w:t>
       </w:r>
       <w:bookmarkEnd w:id="5"/>
@@ -4375,7 +4380,7 @@
         <w:spacing w:before="280" w:after="120"/>
       </w:pPr>
       <w:bookmarkStart w:id="6" w:name="_a0cvv8ir0wbh" w:colFirst="0" w:colLast="0"/>
-      <w:bookmarkStart w:id="7" w:name="_Toc242715154"/>
+      <w:bookmarkStart w:id="7" w:name="_Toc243143925"/>
       <w:bookmarkEnd w:id="6"/>
       <w:r>
         <w:t>1.1 Identificación y Planteamiento del Problema</w:t>
@@ -4419,7 +4424,8 @@
         <w:jc w:val="both"/>
       </w:pPr>
       <w:r>
-        <w:t>En síntesis, el problema que aborda esta investigación se configura en la intersección de tres dimensiones: la necesidad organizacional de automatizar el soporte al cliente, la diversidad de modelos LLM disponibles y la ausencia de un framework integrado que contemple calidad, costo, latencia e impacto del RAG como variables simultáneas de evaluación, procesadas a escala mediante herramientas de Big Data.</w:t>
+        <w:lastRenderedPageBreak/>
+        <w:t>En síntesis, el problema que aborda esta investigación se configura en la intersección de tres dimensiones: la necesidad organizacional de automatizar el soporte al cliente, la diversidad de modelos LLM disponibles y la ausencia de un framework integrado y reproducible que contemple la calidad, el costo, la latencia y el impacto de RAG como variables simultáneas de evaluación.</w:t>
       </w:r>
     </w:p>
     <w:p/>
@@ -4429,7 +4435,7 @@
         <w:spacing w:before="280" w:after="120"/>
       </w:pPr>
       <w:bookmarkStart w:id="8" w:name="_9ovq9tfge2xf" w:colFirst="0" w:colLast="0"/>
-      <w:bookmarkStart w:id="9" w:name="_Toc242715155"/>
+      <w:bookmarkStart w:id="9" w:name="_Toc243143926"/>
       <w:bookmarkEnd w:id="8"/>
       <w:r>
         <w:t>1.2 Pregunta de Investigación</w:t>
@@ -4461,7 +4467,7 @@
           <w:i/>
           <w:iCs/>
         </w:rPr>
-        <w:t>¿En qué medida los modelos LLM de código abierto, potenciados con RAG sobre datos propios de la organización, alcanzan niveles de calidad de respuesta comparables a los de modelos propietarios, y qué diferencias presentan en términos de costo operativo y latencia, cuando son evaluados sobre un corpus de soporte al cliente procesado mediante herramientas de Big Data?</w:t>
+        <w:t>¿En qué medida los modelos LLM de código abierto, potenciados con RAG sobre datos propios de la organización, alcanzan niveles de calidad de respuesta comparables a los de modelos propietarios, y qué diferencias presentan en términos de costo operativo y latencia, cuando se evalúan mediante un mismo protocolo reproducible sobre un corpus de soporte al cliente?</w:t>
       </w:r>
     </w:p>
     <w:p/>
@@ -4518,7 +4524,7 @@
         <w:spacing w:before="280" w:after="120"/>
       </w:pPr>
       <w:bookmarkStart w:id="10" w:name="_wlqqiwfxq7xz" w:colFirst="0" w:colLast="0"/>
-      <w:bookmarkStart w:id="11" w:name="_Toc242715156"/>
+      <w:bookmarkStart w:id="11" w:name="_Toc243143927"/>
       <w:bookmarkEnd w:id="10"/>
       <w:r>
         <w:t>1.3 Hipótesis de Investigación</w:t>
@@ -4543,7 +4549,7 @@
         <w:jc w:val="both"/>
       </w:pPr>
       <w:bookmarkStart w:id="12" w:name="_67xtz98jj70r" w:colFirst="0" w:colLast="0"/>
-      <w:bookmarkStart w:id="13" w:name="_Toc242715157"/>
+      <w:bookmarkStart w:id="13" w:name="_Toc243143928"/>
       <w:bookmarkEnd w:id="12"/>
       <w:r>
         <w:t>Hipótesis 1  Calidad de respuesta con RAG</w:t>
@@ -4568,7 +4574,7 @@
         <w:jc w:val="both"/>
       </w:pPr>
       <w:bookmarkStart w:id="14" w:name="_w1dmls6wpuis" w:colFirst="0" w:colLast="0"/>
-      <w:bookmarkStart w:id="15" w:name="_Toc242715158"/>
+      <w:bookmarkStart w:id="15" w:name="_Toc243143929"/>
       <w:bookmarkEnd w:id="14"/>
       <w:r>
         <w:t>Hipótesis 2  Eficiencia de costos a escala</w:t>
@@ -4593,7 +4599,7 @@
         <w:jc w:val="both"/>
       </w:pPr>
       <w:bookmarkStart w:id="16" w:name="_ozra8bxztd4j" w:colFirst="0" w:colLast="0"/>
-      <w:bookmarkStart w:id="17" w:name="_Toc242715159"/>
+      <w:bookmarkStart w:id="17" w:name="_Toc243143930"/>
       <w:bookmarkEnd w:id="16"/>
       <w:r>
         <w:t>Hipótesis 3  Índice compuesto costo-calidad-latencia</w:t>
@@ -4630,6 +4636,7 @@
         <w:jc w:val="both"/>
       </w:pPr>
       <w:r>
+        <w:lastRenderedPageBreak/>
         <w:t>Las tres hipótesis serán sometidas a prueba empírica en la fase de experimentación, mediante pruebas estadísticas apropiadas según la distribución de los datos obtenidos, a determinar en dicha fase de análisis.</w:t>
       </w:r>
     </w:p>
@@ -4649,7 +4656,7 @@
         <w:spacing w:before="280" w:after="120"/>
       </w:pPr>
       <w:bookmarkStart w:id="18" w:name="_mugszh5fmbq5" w:colFirst="0" w:colLast="0"/>
-      <w:bookmarkStart w:id="19" w:name="_Toc242715160"/>
+      <w:bookmarkStart w:id="19" w:name="_Toc243143931"/>
       <w:bookmarkEnd w:id="18"/>
       <w:r>
         <w:t>1.4 Objetivos de la Investigación</w:t>
@@ -4664,7 +4671,7 @@
         <w:jc w:val="both"/>
       </w:pPr>
       <w:bookmarkStart w:id="20" w:name="_dfkjpqsdst84" w:colFirst="0" w:colLast="0"/>
-      <w:bookmarkStart w:id="21" w:name="_Toc242715161"/>
+      <w:bookmarkStart w:id="21" w:name="_Toc243143932"/>
       <w:bookmarkEnd w:id="20"/>
       <w:r>
         <w:t>1.4.1 Objetivo General</w:t>
@@ -4678,7 +4685,7 @@
         <w:jc w:val="both"/>
       </w:pPr>
       <w:r>
-        <w:t>Diseñar, implementar y validar un framework comparativo de modelos LLM para el soporte al cliente automatizado, que evalúe simultáneamente la calidad semántica de las respuestas, el costo operativo y la latencia, considerando el impacto de la técnica RAG sobre datos propios de la organización, mediante un pipeline de procesamiento basado en herramientas de Big Data.</w:t>
+        <w:t>Diseñar, implementar y validar un framework comparativo de modelos LLM para el soporte al cliente automatizado, que evalúe simultáneamente la calidad semántica de las respuestas, el costo operativo y la latencia, y que permita medir el impacto de RAG sobre datos propios mediante un pipeline reproducible de ingesta, recuperación, generación y evaluación.</w:t>
       </w:r>
     </w:p>
     <w:p/>
@@ -4689,7 +4696,7 @@
         <w:jc w:val="both"/>
       </w:pPr>
       <w:bookmarkStart w:id="22" w:name="_q76px3yw8zx7" w:colFirst="0" w:colLast="0"/>
-      <w:bookmarkStart w:id="23" w:name="_Toc242715162"/>
+      <w:bookmarkStart w:id="23" w:name="_Toc243143933"/>
       <w:bookmarkEnd w:id="22"/>
       <w:r>
         <w:t>1.4.2 Objetivos Específicos</w:t>
@@ -4703,7 +4710,7 @@
         <w:ind w:left="720" w:hanging="360"/>
       </w:pPr>
       <w:r>
-        <w:t>1.Construir un pipeline de ingesta y preprocesamiento de conversaciones de soporte al cliente utilizando Apache Spark en modo local, capaz de procesar el corpus de datos a escala.</w:t>
+        <w:t>1. Construir un pipeline reproducible de ingesta, validación y preprocesamiento de consultas de soporte al cliente, capaz de normalizar datos externos mediante un esquema común y conservar su trazabilidad.</w:t>
       </w:r>
     </w:p>
     <w:p/>
@@ -4713,7 +4720,7 @@
         <w:ind w:left="720" w:hanging="360"/>
       </w:pPr>
       <w:r>
-        <w:t>2.Implementar una base de conocimiento vectorial (FAISS/ChromaDB) e integrar la técnica RAG mediante LangChain para contextualizar las respuestas de los modelos con datos propios de la organización.</w:t>
+        <w:t>2. Implementar un módulo de recuperación vectorial basado en embeddings y similitud coseno que incorpore conocimiento externo para contextualizar las respuestas de los modelos con datos propios de la organización.</w:t>
       </w:r>
     </w:p>
     <w:p/>
@@ -4723,7 +4730,7 @@
         <w:ind w:left="720" w:hanging="360"/>
       </w:pPr>
       <w:r>
-        <w:t>3.Evaluar comparativamente al menos tres modelos LLM (GPT-4o mini, LLaMA 3, Mistral) en la condición con RAG, midiendo BERTScore, ROUGE, latencia y costo operativo por consulta, utilizando la condición sin RAG (zero-shot) como línea base de control que permita aislar el aporte de la recuperación sobre el desempeño de cada modelo.</w:t>
+        <w:t>3. Evaluar comparativamente al menos tres modelos LLM (GPT-4o mini, LLaMA 3, Mistral) en la condición con RAG, midiendo BERTScore, ROUGE, latencia y costo operativo por consulta, utilizando la condición sin RAG (zero-shot) como línea base de control que permita aislar el aporte de la recuperación sobre el desempeño de cada modelo.</w:t>
       </w:r>
     </w:p>
     <w:p/>
@@ -4733,7 +4740,7 @@
         <w:ind w:left="720" w:hanging="360"/>
       </w:pPr>
       <w:r>
-        <w:t>4.Desarrollar un dashboard interactivo en Streamlit que consolide los resultados del análisis comparativo y genere una guía de selección de modelo según el perfil operativo de la organización.</w:t>
+        <w:t>4. Desarrollar un dashboard interactivo en Streamlit que consolide los resultados del análisis comparativo y genere una guía de selección de modelo según el perfil operativo de la organización.</w:t>
       </w:r>
     </w:p>
     <w:p/>
@@ -4743,7 +4750,7 @@
         <w:spacing w:before="280" w:after="120"/>
       </w:pPr>
       <w:bookmarkStart w:id="24" w:name="_qi2j9ew9n21q" w:colFirst="0" w:colLast="0"/>
-      <w:bookmarkStart w:id="25" w:name="_Toc242715163"/>
+      <w:bookmarkStart w:id="25" w:name="_Toc243143934"/>
       <w:bookmarkEnd w:id="24"/>
       <w:r>
         <w:t>1.5 Justificación del Tema y Tipo de Trabajo</w:t>
@@ -4819,7 +4826,11 @@
         <w:jc w:val="both"/>
       </w:pPr>
       <w:r>
-        <w:t>La literatura existente aborda la evaluación de LLMs para soporte al cliente de forma fragmentada, sin integrar dimensiones de costo, latencia e impacto del RAG en un único sistema evaluado con herramientas de Big Data. Este trabajo cubre ese vacío y propone un marco metodológico replicable bajo el paradigma Design Science Research (Hevner et al., 2004).</w:t>
+        <w:t xml:space="preserve">La literatura existente aborda la evaluación de LLMs para soporte al cliente de forma fragmentada, sin integrar las dimensiones de costo, latencia e impacto de RAG en un mismo sistema </w:t>
+      </w:r>
+      <w:r>
+        <w:lastRenderedPageBreak/>
+        <w:t>reproducible. Este trabajo cubre ese vacío y propone un marco metodológico replicable bajo el paradigma Design Science Research (Hevner et al., 2004).</w:t>
       </w:r>
     </w:p>
     <w:p/>
@@ -4853,7 +4864,7 @@
         <w:spacing w:before="280" w:after="120"/>
       </w:pPr>
       <w:bookmarkStart w:id="26" w:name="_j7jawdn9aaox" w:colFirst="0" w:colLast="0"/>
-      <w:bookmarkStart w:id="27" w:name="_Toc242715164"/>
+      <w:bookmarkStart w:id="27" w:name="_Toc243143935"/>
       <w:bookmarkEnd w:id="26"/>
       <w:r>
         <w:t>1.6 Estructura General de la Tesis</w:t>
@@ -4894,7 +4905,7 @@
         <w:ind w:left="720" w:hanging="360"/>
       </w:pPr>
       <w:r>
-        <w:t>• El Capítulo 4 detalla el diseño del framework: arquitectura, pipeline de ingesta con Spark, base vectorial y módulo de evaluación.</w:t>
+        <w:t>• El Capítulo 4 detalla el diseño del framework: validación e ingesta mediante un esquema común, recuperación vectorial, generación y evaluación.</w:t>
       </w:r>
     </w:p>
     <w:p>
@@ -4939,6 +4950,7 @@
         <w:ind w:left="720" w:hanging="360"/>
       </w:pPr>
       <w:r>
+        <w:lastRenderedPageBreak/>
         <w:t>• Las Referencias, Anexos y Acrónimos completan el trabajo con bibliografía APA 7, código fuente y glosario.</w:t>
       </w:r>
     </w:p>
@@ -4951,9 +4963,10 @@
         <w:jc w:val="center"/>
       </w:pPr>
       <w:bookmarkStart w:id="28" w:name="_sylgmgf7mrz8" w:colFirst="0" w:colLast="0"/>
-      <w:bookmarkStart w:id="29" w:name="_Toc242715165"/>
+      <w:bookmarkStart w:id="29" w:name="_Toc243143936"/>
       <w:bookmarkEnd w:id="28"/>
       <w:r>
+        <w:lastRenderedPageBreak/>
         <w:t>Capítulo 2 - Marco Teórico y Estado del Arte</w:t>
       </w:r>
       <w:bookmarkEnd w:id="29"/>
@@ -4965,7 +4978,7 @@
         <w:spacing w:before="280" w:after="120"/>
       </w:pPr>
       <w:bookmarkStart w:id="30" w:name="_cmd6k582zx0a" w:colFirst="0" w:colLast="0"/>
-      <w:bookmarkStart w:id="31" w:name="_Toc242715166"/>
+      <w:bookmarkStart w:id="31" w:name="_Toc243143937"/>
       <w:bookmarkEnd w:id="30"/>
       <w:r>
         <w:t>2.1 Modelos de Lenguaje de Gran Escala</w:t>
@@ -5007,7 +5020,11 @@
         <w:jc w:val="both"/>
       </w:pPr>
       <w:r>
-        <w:t>Sobre esa base, Devlin et al. (2019) introducen BERT, modelo de representación bidireccional preentrenado que estableció el paradigma de preentrenamiento seguido de ajuste fino. Dicho paradigma sigue vigente en aplicaciones que requieren representaciones semánticas densas, entre ellas la métrica de evaluación empleada en este trabajo. Posteriormente, Brown et al. (2020) demostraron con GPT-3 que el escalamiento de parámetros y datos produce capacidades emergentes de aprendizaje en contexto, el modelo resuelve tareas nuevas a partir de instrucciones en lenguaje natural, sin reentrenamiento. Este hallazgo resulta central para la presente investigación, dado que habilita el uso de LLMs en soporte al cliente sin incurrir en los costos asociados al ajuste fino sobre datos propios.</w:t>
+        <w:t xml:space="preserve">Sobre esa base, Devlin et al. (2019) introducen BERT, modelo de representación bidireccional preentrenado que estableció el paradigma de preentrenamiento seguido de ajuste fino. Dicho paradigma sigue vigente en aplicaciones que requieren representaciones semánticas densas, entre ellas la métrica de evaluación empleada en este trabajo. Posteriormente, Brown et al. (2020) demostraron con GPT-3 que el escalamiento de parámetros y datos produce capacidades </w:t>
+      </w:r>
+      <w:r>
+        <w:lastRenderedPageBreak/>
+        <w:t>emergentes de aprendizaje en contexto, el modelo resuelve tareas nuevas a partir de instrucciones en lenguaje natural, sin reentrenamiento. Este hallazgo resulta central para la presente investigación, dado que habilita el uso de LLMs en soporte al cliente sin incurrir en los costos asociados al ajuste fino sobre datos propios.</w:t>
       </w:r>
     </w:p>
     <w:p>
@@ -5025,7 +5042,7 @@
         <w:spacing w:before="280" w:after="120"/>
       </w:pPr>
       <w:bookmarkStart w:id="32" w:name="_en61jvdiq65f" w:colFirst="0" w:colLast="0"/>
-      <w:bookmarkStart w:id="33" w:name="_Toc242715167"/>
+      <w:bookmarkStart w:id="33" w:name="_Toc243143938"/>
       <w:bookmarkEnd w:id="32"/>
       <w:r>
         <w:t>2.2 Recuperación Aumentada con Generación</w:t>
@@ -5058,6 +5075,7 @@
         <w:jc w:val="both"/>
       </w:pPr>
       <w:r>
+        <w:lastRenderedPageBreak/>
         <w:t>Gao et al. (2023) sistematizan la evolución posterior del campo y distinguen tres paradigmas sucesivos: el RAG ingenuo, que implementa el ciclo básico de indexación, recuperación y generación; el RAG avanzado, que incorpora optimizaciones previas y posteriores a la recuperación, tales como la reescritura de consultas y el reordenamiento de fragmentos; y el RAG modular, que reorganiza los componentes en módulos intercambiables. Los mismos autores destacan que la calidad final del sistema depende de manera conjunta de la etapa de recuperación y de la capacidad generativa del modelo, lo que implica que un mismo esquema RAG puede producir resultados divergentes según el LLM sobre el cual se implemente. Esta observación fundamenta directamente la tercera hipótesis del presente trabajo.</w:t>
       </w:r>
     </w:p>
@@ -5067,7 +5085,7 @@
         <w:jc w:val="both"/>
       </w:pPr>
       <w:r>
-        <w:t>En cuanto al componente de indexación, Johnson et al. (2019) desarrollaron FAISS, biblioteca de búsqueda por similitud que implementa algoritmos de cuantización y particionamiento del espacio vectorial, con soporte para ejecución sobre unidades de procesamiento gráfico. La biblioteca permite operar sobre conjuntos de miles de millones de vectores manteniendo tiempos de respuesta compatibles con aplicaciones interactivas. Su carácter de código abierto y su ejecución local la convierten en una opción adecuada para organizaciones con requisitos de privacidad sobre sus datos, dado que el corpus no requiere ser transferido a servicios de terceros. Por estas razones se adopta como componente de indexación en el framework propuesto.</w:t>
+        <w:t>En cuanto al componente de indexación, Johnson et al. (2019) desarrollaron FAISS, biblioteca de búsqueda por similitud que implementa algoritmos de cuantización y particionamiento del espacio vectorial, con soporte para ejecución sobre unidades de procesamiento gráfico. La biblioteca permite operar sobre conjuntos de miles de millones de vectores manteniendo tiempos de respuesta compatibles con aplicaciones interactivas. Su carácter de código abierto y su ejecución local la convierten en una alternativa adecuada para organizaciones con requisitos de privacidad. En el prototipo evaluado se utiliza búsqueda exacta con NumPy, debido a que el corpus contiene 81 documentos; FAISS se reserva como opción de escalamiento cuando el volumen permita medir una ventaja real.</w:t>
       </w:r>
     </w:p>
     <w:p>
@@ -5076,7 +5094,7 @@
         <w:spacing w:before="280" w:after="120"/>
       </w:pPr>
       <w:bookmarkStart w:id="34" w:name="_xiy6olpx7omr" w:colFirst="0" w:colLast="0"/>
-      <w:bookmarkStart w:id="35" w:name="_Toc242715168"/>
+      <w:bookmarkStart w:id="35" w:name="_Toc243143939"/>
       <w:bookmarkEnd w:id="34"/>
       <w:r>
         <w:t>2.3 Métricas de Evaluación en NLP</w:t>
@@ -5109,6 +5127,7 @@
         <w:ind w:left="720" w:hanging="360"/>
       </w:pPr>
       <w:r>
+        <w:lastRenderedPageBreak/>
         <w:t>• ROUGE (Recall-Oriented Understudy for Gisting Evaluation): mide el solapamiento de n-gramas entre la respuesta generada y la referencia. Es ampliamente utilizado en tareas de resumen y generación de texto.</w:t>
       </w:r>
     </w:p>
@@ -5146,7 +5165,11 @@
         <w:jc w:val="both"/>
       </w:pPr>
       <w:r>
-        <w:t>La tercera familia emplea un modelo de lenguaje como evaluador. Zheng et al. (2023) analizan sistemáticamente esta modalidad y reportan que evaluadores basados en modelos de alta capacidad alcanzan niveles de concordancia con las preferencias humanas superiores al ochenta por ciento, equivalentes al acuerdo observado entre evaluadores humanos. Los mismos autores identifican no obstante sesgos sistemáticos de posición, de verbosidad y de autopreferencia, que exigen precauciones metodológicas en su aplicación. Esta modalidad se contempla como instrumento complementario en dimensiones cualitativas tales como claridad y adecuación del tono, que las métricas automáticas no capturan.</w:t>
+        <w:t xml:space="preserve">La tercera familia emplea un modelo de lenguaje como evaluador. Zheng et al. (2023) analizan sistemáticamente esta modalidad y reportan que evaluadores basados en modelos de alta capacidad alcanzan niveles de concordancia con las preferencias humanas superiores al ochenta por ciento, equivalentes al acuerdo observado entre evaluadores humanos. Los mismos autores identifican no obstante sesgos sistemáticos de posición, de verbosidad y de autopreferencia, que exigen precauciones metodológicas en su aplicación. Esta modalidad se contempla como instrumento </w:t>
+      </w:r>
+      <w:r>
+        <w:lastRenderedPageBreak/>
+        <w:t>complementario en dimensiones cualitativas tales como claridad y adecuación del tono, que las métricas automáticas no capturan.</w:t>
       </w:r>
     </w:p>
     <w:p>
@@ -5155,10 +5178,10 @@
         <w:spacing w:before="280" w:after="120"/>
       </w:pPr>
       <w:bookmarkStart w:id="36" w:name="_esy3ul8xth1b" w:colFirst="0" w:colLast="0"/>
-      <w:bookmarkStart w:id="37" w:name="_Toc242715169"/>
+      <w:bookmarkStart w:id="37" w:name="_Toc243143940"/>
       <w:bookmarkEnd w:id="36"/>
       <w:r>
-        <w:t>2.4 Big Data aplicado al procesamiento de texto</w:t>
+        <w:t>2.4 Procesamiento reproducible de datos textuales</w:t>
       </w:r>
       <w:bookmarkEnd w:id="37"/>
     </w:p>
@@ -5169,7 +5192,7 @@
         <w:jc w:val="both"/>
       </w:pPr>
       <w:r>
-        <w:t>El procesamiento de grandes volúmenes de conversaciones de soporte al cliente requiere herramientas capaces de escalar horizontalmente. Apache Spark es un motor de procesamiento distribuido que permite ejecutar pipelines de transformación de datos en modo local o en clústeres, mediante su API de DataFrames y su módulo de procesamiento de lenguaje natural (Spark NLP). En el contexto de este trabajo, Spark se utiliza para la ingesta, limpieza y preprocesamiento del corpus de conversaciones, garantizando que el framework sea reproducible a distintas escalas de volumen de datos.</w:t>
+        <w:t>El procesamiento de conversaciones de soporte al cliente requiere procedimientos reproducibles de ingesta, validación, limpieza y trazabilidad. En este trabajo, el corpus de 26.872 registros y la muestra ampliada de 324 consultas se procesan en memoria con Pandas, una decisión suficiente y auditable para el volumen observado. La arquitectura separa las etapas del pipeline para que, si el volumen futuro supera la capacidad de una única máquina, el procesamiento pueda migrarse a un motor distribuido sin modificar el protocolo experimental.</w:t>
       </w:r>
     </w:p>
     <w:p>
@@ -5178,7 +5201,7 @@
         <w:jc w:val="both"/>
       </w:pPr>
       <w:r>
-        <w:t>Zaharia et al. (2016) presentan Apache Spark como un motor unificado de procesamiento distribuido que integra, bajo una misma interfaz de programación, operaciones por lotes, consultas estructuradas, procesamiento de flujos y aprendizaje automático. La arquitectura del sistema se apoya en conjuntos de datos distribuidos resilientes, abstracción que permite recuperar particiones ante fallos sin necesidad de replicación explícita.</w:t>
+        <w:t>Zaharia et al. (2016) presentan Apache Spark como un motor unificado de procesamiento distribuido que integra operaciones por lotes, consultas estructuradas, procesamiento de flujos y aprendizaje automático. Esta arquitectura constituye una alternativa pertinente para una futura ampliación a millones de conversaciones, pero no forma parte del prototipo experimental evaluado en este Trabajo Final.</w:t>
       </w:r>
     </w:p>
     <w:p>
@@ -5187,7 +5210,7 @@
         <w:jc w:val="both"/>
       </w:pPr>
       <w:r>
-        <w:t>La decisión de utilizarlo en modo local no responde a una necesidad de cómputo distribuido en la escala experimental prevista, sino a un criterio de reproducibilidad, el pipeline construido resulta transferible sin modificaciones a un entorno de clúster cuando el volumen de datos lo requiera, lo que preserva la aplicabilidad del framework en organizaciones con corpus de magnitud considerablemente mayor.</w:t>
+        <w:t>En la escala actual, la reproducibilidad se obtiene mediante identificadores estables, semillas controladas, validaciones de esquema, checkpoints y archivos de auditoría. El procesamiento distribuido queda fuera del alcance del prototipo y se considera una alternativa de escalamiento que deberá validarse con un corpus de magnitud considerablemente mayor.</w:t>
       </w:r>
     </w:p>
     <w:p>
@@ -5195,7 +5218,7 @@
         <w:pStyle w:val="Ttulo2"/>
       </w:pPr>
       <w:bookmarkStart w:id="38" w:name="_jrll2q5g0luc" w:colFirst="0" w:colLast="0"/>
-      <w:bookmarkStart w:id="39" w:name="_Toc242715170"/>
+      <w:bookmarkStart w:id="39" w:name="_Toc243143941"/>
       <w:bookmarkEnd w:id="38"/>
       <w:r>
         <w:t>2.5 Estado del Arte</w:t>
@@ -5210,7 +5233,11 @@
     <w:p/>
     <w:p>
       <w:r>
-        <w:t>Casazola Cruz et al. (2021) y Garzón-Quiroz et al. (2025) coinciden en que los chatbots basados en reglas conservan ventajas de simplicidad y costo para tareas previsibles, pero pierden capacidad cuando la interacción exige interpretar variaciones lingüísticas o mantener contexto. Esta coincidencia permite fundamentar el pasaje hacia sistemas basados en lenguaje natural, aunque ambos trabajos también advierten que la mayor flexibilidad tecnológica no elimina la necesidad de diseñar la experiencia de uso y controlar la calidad de las respuestas.</w:t>
+        <w:t xml:space="preserve">Casazola Cruz et al. (2021) y Garzón-Quiroz et al. (2025) coinciden en que los chatbots basados en reglas conservan ventajas de simplicidad y costo para tareas previsibles, pero pierden capacidad cuando la interacción exige interpretar variaciones lingüísticas o mantener contexto. Esta coincidencia permite fundamentar el pasaje hacia sistemas basados en lenguaje natural, </w:t>
+      </w:r>
+      <w:r>
+        <w:lastRenderedPageBreak/>
+        <w:t>aunque ambos trabajos también advierten que la mayor flexibilidad tecnológica no elimina la necesidad de diseñar la experiencia de uso y controlar la calidad de las respuestas.</w:t>
       </w:r>
     </w:p>
     <w:p/>
@@ -5234,7 +5261,11 @@
     <w:p/>
     <w:p>
       <w:r>
-        <w:t>La literatura reciente también discute cómo evaluar estos sistemas. Es et al. (2024) separan la evaluación en relevancia del contexto, fidelidad al contexto y calidad de la respuesta. Saad-Falcon et al. (2024) proponen un marco automatizado que conserva una muestra reducida de anotaciones humanas para controlar los errores de los evaluadores automáticos. Ambos trabajos cuestionan que una única métrica de generación sea suficiente para describir el funcionamiento de un pipeline RAG.</w:t>
+        <w:t xml:space="preserve">La literatura reciente también discute cómo evaluar estos sistemas. Es et al. (2024) separan la evaluación en relevancia del contexto, fidelidad al contexto y calidad de la respuesta. Saad-Falcon et al. (2024) proponen un marco automatizado que conserva una muestra reducida de anotaciones humanas para controlar los errores de los evaluadores automáticos. Ambos trabajos </w:t>
+      </w:r>
+      <w:r>
+        <w:lastRenderedPageBreak/>
+        <w:t>cuestionan que una única métrica de generación sea suficiente para describir el funcionamiento de un pipeline RAG.</w:t>
       </w:r>
     </w:p>
     <w:p/>
@@ -5249,7 +5280,7 @@
         <w:pStyle w:val="Ttulo2"/>
         <w:spacing w:before="280" w:after="120"/>
       </w:pPr>
-      <w:bookmarkStart w:id="40" w:name="_Toc242715171"/>
+      <w:bookmarkStart w:id="40" w:name="_Toc243143942"/>
       <w:r>
         <w:t>2.6 Síntesis crítica y vacío identificado</w:t>
       </w:r>
@@ -5271,7 +5302,11 @@
     <w:p/>
     <w:p>
       <w:r>
-        <w:t>El vacío identificado consiste en la ausencia de una evaluación integrada, reproducible y aplicada al soporte al cliente que compare modelos propietarios y abiertos sobre las mismas consultas, en condiciones con y sin RAG, y que relacione calidad, costo y latencia con evidencia automática y humana. El framework propuesto aborda ese vacío mediante un diseño pareado, un corpus trazable, métricas diferenciadas y un dashboard que permite interpretar los compromisos entre variables sin reducir la selección a un único puntaje.</w:t>
+        <w:t xml:space="preserve">El vacío identificado consiste en la ausencia de una evaluación integrada, reproducible y aplicada al soporte al cliente que compare modelos propietarios y abiertos sobre las mismas consultas, en condiciones con y sin RAG, y que relacione calidad, costo y latencia con evidencia automática y humana. El framework propuesto aborda ese vacío mediante un diseño pareado, un corpus </w:t>
+      </w:r>
+      <w:r>
+        <w:lastRenderedPageBreak/>
+        <w:t>trazable, métricas diferenciadas y un dashboard que permite interpretar los compromisos entre variables sin reducir la selección a un único puntaje.</w:t>
       </w:r>
     </w:p>
     <w:p/>
@@ -5282,8 +5317,9 @@
         <w:spacing w:before="400" w:after="200"/>
         <w:jc w:val="center"/>
       </w:pPr>
-      <w:bookmarkStart w:id="42" w:name="_Toc242715172"/>
-      <w:r>
+      <w:bookmarkStart w:id="42" w:name="_Toc243143943"/>
+      <w:r>
+        <w:lastRenderedPageBreak/>
         <w:t>Capítulo 3 - Metodología de la Investigación</w:t>
       </w:r>
       <w:bookmarkEnd w:id="42"/>
@@ -5299,7 +5335,7 @@
         <w:pStyle w:val="Ttulo2"/>
         <w:spacing w:before="280" w:after="120"/>
       </w:pPr>
-      <w:bookmarkStart w:id="43" w:name="_Toc242715173"/>
+      <w:bookmarkStart w:id="43" w:name="_Toc243143944"/>
       <w:r>
         <w:t>3.1 Paradigma y enfoque metodológico</w:t>
       </w:r>
@@ -5319,7 +5355,7 @@
         <w:pStyle w:val="Ttulo2"/>
         <w:spacing w:before="280" w:after="120"/>
       </w:pPr>
-      <w:bookmarkStart w:id="44" w:name="_Toc242715174"/>
+      <w:bookmarkStart w:id="44" w:name="_Toc243143945"/>
       <w:r>
         <w:t>3.2 Diseño de la investigación</w:t>
       </w:r>
@@ -5348,7 +5384,7 @@
         <w:pStyle w:val="Ttulo2"/>
         <w:spacing w:before="280" w:after="120"/>
       </w:pPr>
-      <w:bookmarkStart w:id="45" w:name="_Toc242715175"/>
+      <w:bookmarkStart w:id="45" w:name="_Toc243143946"/>
       <w:r>
         <w:t>3.3 Variables e instrumentos de medición</w:t>
       </w:r>
@@ -5396,6 +5432,7 @@
         <w:jc w:val="both"/>
       </w:pPr>
       <w:r>
+        <w:lastRenderedPageBreak/>
         <w:t>BERTScore capta similitud semántica contextual y ROUGE-L mide coincidencia de secuencias. Las dos métricas se informan en conjunto porque una respuesta válida puede expresar la misma idea con diferente redacción. No se utiliza una única métrica como sustituto de la evaluación humana.</w:t>
       </w:r>
     </w:p>
@@ -5404,7 +5441,7 @@
         <w:pStyle w:val="Ttulo2"/>
         <w:spacing w:before="280" w:after="120"/>
       </w:pPr>
-      <w:bookmarkStart w:id="46" w:name="_Toc242715176"/>
+      <w:bookmarkStart w:id="46" w:name="_Toc243143947"/>
       <w:r>
         <w:t>3.4 Dataset y corpus de datos</w:t>
       </w:r>
@@ -5416,7 +5453,7 @@
         <w:jc w:val="both"/>
       </w:pPr>
       <w:r>
-        <w:t>La fuente es Bitext Customer Support LLM Chatbot Training Dataset (Bitext, s. f.), con 26.872 registros, 11 categorías y 27 intenciones. La muestra experimental contiene 20 consultas estratificadas y sus respuestas de referencia. Ambas se tradujeron al español una sola vez y se guardaron en el repositorio para que todas las corridas utilicen exactamente el mismo insumo.</w:t>
+        <w:t>La fuente utilizada para desarrollar y validar el framework es Bitext Customer Support LLM Chatbot Training Dataset (Bitext, s. f.), con 26.872 registros, 11 categorías y 27 intenciones. El piloto contiene 20 consultas estratificadas y la ampliación 324 consultas, ambas con sus respuestas de referencia traducidas al español y persistidas para asegurar que todas las corridas utilicen el mismo insumo. Bitext no constituye una restricción del artefacto: los datos externos se normalizan mediante un esquema común antes de ingresar al pipeline.</w:t>
       </w:r>
     </w:p>
     <w:p>
@@ -5433,7 +5470,7 @@
         <w:pStyle w:val="Ttulo2"/>
         <w:spacing w:before="280" w:after="120"/>
       </w:pPr>
-      <w:bookmarkStart w:id="47" w:name="_Toc242715177"/>
+      <w:bookmarkStart w:id="47" w:name="_Toc243143948"/>
       <w:r>
         <w:t>3.5 Procedimiento experimental</w:t>
       </w:r>
@@ -5498,8 +5535,9 @@
         <w:pStyle w:val="Ttulo2"/>
         <w:spacing w:before="280" w:after="120"/>
       </w:pPr>
-      <w:bookmarkStart w:id="48" w:name="_Toc242715178"/>
-      <w:r>
+      <w:bookmarkStart w:id="48" w:name="_Toc243143949"/>
+      <w:r>
+        <w:lastRenderedPageBreak/>
         <w:t>3.6 Alcance y controles del piloto RAG</w:t>
       </w:r>
       <w:bookmarkEnd w:id="48"/>
@@ -5527,7 +5565,7 @@
         <w:pStyle w:val="Ttulo2"/>
         <w:spacing w:before="280" w:after="120"/>
       </w:pPr>
-      <w:bookmarkStart w:id="49" w:name="_Toc242715179"/>
+      <w:bookmarkStart w:id="49" w:name="_Toc243143950"/>
       <w:r>
         <w:t>3.7 Modelo de costos y fuentes</w:t>
       </w:r>
@@ -5556,7 +5594,7 @@
         <w:pStyle w:val="Ttulo2"/>
       </w:pPr>
       <w:bookmarkStart w:id="50" w:name="_t01y384neuv8" w:colFirst="0" w:colLast="0"/>
-      <w:bookmarkStart w:id="51" w:name="_Toc242715180"/>
+      <w:bookmarkStart w:id="51" w:name="_Toc243143951"/>
       <w:bookmarkEnd w:id="50"/>
       <w:r>
         <w:t>3.8 Ampliación del experimento y evaluación humana</w:t>
@@ -5570,7 +5608,11 @@
     </w:p>
     <w:p>
       <w:r>
-        <w:t>La muestra ampliada contiene 324 consultas: 12 para cada una de las 27 intenciones del corpus Bitext. Esta cantidad se eligió porque se encuentra dentro del rango de 300 a 500 consultas previsto en el diseño y permite una representación equilibrada de todas las intenciones. La selección se auditó para evitar duplicados y solapamientos con los documentos utilizados como conocimiento recuperable.</w:t>
+        <w:t xml:space="preserve">La muestra ampliada contiene 324 consultas: 12 para cada una de las 27 intenciones del corpus Bitext. Esta cantidad se eligió porque se encuentra dentro del rango de 300 a 500 consultas previsto en el diseño y permite una representación equilibrada de todas las intenciones. La </w:t>
+      </w:r>
+      <w:r>
+        <w:lastRenderedPageBreak/>
+        <w:t>selección se auditó para evitar duplicados y solapamientos con los documentos utilizados como conocimiento recuperable.</w:t>
       </w:r>
     </w:p>
     <w:p/>
@@ -5593,8 +5635,9 @@
         <w:spacing w:before="400" w:after="200"/>
         <w:jc w:val="center"/>
       </w:pPr>
-      <w:bookmarkStart w:id="52" w:name="_Toc242715181"/>
-      <w:r>
+      <w:bookmarkStart w:id="52" w:name="_Toc243143952"/>
+      <w:r>
+        <w:lastRenderedPageBreak/>
         <w:t>Capítulo 4 - Diseño del Framework</w:t>
       </w:r>
       <w:bookmarkEnd w:id="52"/>
@@ -5610,7 +5653,7 @@
         <w:pStyle w:val="Ttulo2"/>
         <w:spacing w:before="280" w:after="120"/>
       </w:pPr>
-      <w:bookmarkStart w:id="53" w:name="_Toc242715182"/>
+      <w:bookmarkStart w:id="53" w:name="_Toc243143953"/>
       <w:r>
         <w:t>4.1 Arquitectura implementada</w:t>
       </w:r>
@@ -5622,7 +5665,7 @@
         <w:jc w:val="both"/>
       </w:pPr>
       <w:r>
-        <w:t>El framework separa cuatro componentes: preparación de datos, recuperación, generación y evaluación. Los datos persistidos alimentan un índice en memoria; el recuperador devuelve tres documentos y sus puntajes; el cliente unificado envía la consulta con o sin contexto; y el módulo de evaluación agrega calidad, latencia, tokens y costos en una estructura común. Esta separación permite repetir una etapa sin volver a ejecutar las restantes.</w:t>
+        <w:t>El framework separa cinco componentes: validación y preparación de datos, recuperación, generación, evaluación y visualización. La capa de entrada transforma archivos propios del usuario a un esquema canónico; los datos validados alimentan un índice en memoria; el recuperador devuelve tres documentos y sus puntajes; el cliente unificado envía la consulta con o sin contexto; y los módulos de evaluación y visualización consolidan calidad, latencia, tokens y costos. Esta separación permite reemplazar el corpus o repetir una etapa sin volver a ejecutar las restantes.</w:t>
       </w:r>
     </w:p>
     <w:p>
@@ -5630,7 +5673,7 @@
         <w:pStyle w:val="Ttulo2"/>
         <w:spacing w:before="280" w:after="120"/>
       </w:pPr>
-      <w:bookmarkStart w:id="54" w:name="_Toc242715183"/>
+      <w:bookmarkStart w:id="54" w:name="_Toc243143954"/>
       <w:r>
         <w:t>4.2 Recuperación vectorial</w:t>
       </w:r>
@@ -5650,7 +5693,7 @@
         <w:pStyle w:val="Ttulo2"/>
         <w:spacing w:before="280" w:after="120"/>
       </w:pPr>
-      <w:bookmarkStart w:id="55" w:name="_Toc242715184"/>
+      <w:bookmarkStart w:id="55" w:name="_Toc243143955"/>
       <w:r>
         <w:t>4.3 Control de contaminación</w:t>
       </w:r>
@@ -5670,7 +5713,7 @@
         <w:pStyle w:val="Ttulo2"/>
         <w:spacing w:before="280" w:after="120"/>
       </w:pPr>
-      <w:bookmarkStart w:id="56" w:name="_Toc242715185"/>
+      <w:bookmarkStart w:id="56" w:name="_Toc243143956"/>
       <w:r>
         <w:t>4.4 Estrategia multilingüe</w:t>
       </w:r>
@@ -5690,8 +5733,9 @@
         <w:pStyle w:val="Ttulo2"/>
         <w:spacing w:before="280" w:after="120"/>
       </w:pPr>
-      <w:bookmarkStart w:id="57" w:name="_Toc242715186"/>
-      <w:r>
+      <w:bookmarkStart w:id="57" w:name="_Toc243143957"/>
+      <w:r>
+        <w:lastRenderedPageBreak/>
         <w:t>4.5 Diseño de la medición de costos</w:t>
       </w:r>
       <w:bookmarkEnd w:id="57"/>
@@ -6205,9 +6249,10 @@
         <w:jc w:val="center"/>
       </w:pPr>
       <w:bookmarkStart w:id="58" w:name="_cp5g65h0480f" w:colFirst="0" w:colLast="0"/>
-      <w:bookmarkStart w:id="59" w:name="_Toc242715187"/>
+      <w:bookmarkStart w:id="59" w:name="_Toc243143958"/>
       <w:bookmarkEnd w:id="58"/>
       <w:r>
+        <w:lastRenderedPageBreak/>
         <w:t>Capítulo 5 - Implementación y Prototipo</w:t>
       </w:r>
       <w:bookmarkEnd w:id="59"/>
@@ -6223,7 +6268,7 @@
         <w:pStyle w:val="Ttulo2"/>
         <w:spacing w:before="280" w:after="120"/>
       </w:pPr>
-      <w:bookmarkStart w:id="60" w:name="_Toc242715188"/>
+      <w:bookmarkStart w:id="60" w:name="_Toc243143959"/>
       <w:r>
         <w:t>5.1 Entorno y modelos</w:t>
       </w:r>
@@ -6235,7 +6280,7 @@
         <w:jc w:val="both"/>
       </w:pPr>
       <w:r>
-        <w:t>El prototipo se ejecuta en Windows con Python 3.11. GPT-4o mini se consume mediante la API de OpenAI; LLaMA 3.1 8B y Mistral se sirven localmente con Ollama sobre una NVIDIA RTX 3080 Ti y un AMD Ryzen 5 5600X. Las respuestas se generan con una interfaz común que registra texto, latencia, tokens y error. Las credenciales se leen desde variables de entorno y no se versionan.</w:t>
+        <w:t>El prototipo se ejecuta en Windows con Python 3.11. GPT-4o mini se consume mediante la API de OpenAI; LLaMA 3.1 8B y Mistral se sirven localmente con Ollama sobre una NVIDIA RTX 3080 Ti y un AMD Ryzen 5 5600X. Las respuestas se generan con una interfaz común que registra texto, latencia, tokens y error. Pydantic valida el esquema de entrada y las credenciales se leen desde variables de entorno que no se versionan.</w:t>
       </w:r>
     </w:p>
     <w:p>
@@ -6243,7 +6288,7 @@
         <w:pStyle w:val="Ttulo2"/>
         <w:spacing w:before="280" w:after="120"/>
       </w:pPr>
-      <w:bookmarkStart w:id="61" w:name="_Toc242715189"/>
+      <w:bookmarkStart w:id="61" w:name="_Toc243143960"/>
       <w:r>
         <w:t>5.2 Construcción del corpus RAG</w:t>
       </w:r>
@@ -6263,7 +6308,7 @@
         <w:pStyle w:val="Ttulo2"/>
         <w:spacing w:before="280" w:after="120"/>
       </w:pPr>
-      <w:bookmarkStart w:id="62" w:name="_Toc242715190"/>
+      <w:bookmarkStart w:id="62" w:name="_Toc243143961"/>
       <w:r>
         <w:t>5.3 Pipeline reproducible</w:t>
       </w:r>
@@ -6280,10 +6325,20 @@
     </w:p>
     <w:p>
       <w:pPr>
+        <w:spacing w:after="160"/>
+        <w:jc w:val="both"/>
+      </w:pPr>
+      <w:r>
+        <w:t>La capa de entrada se implementó en esquema_datos.py y acepta archivos CSV, JSON, JSONL y NDJSON. Para las consultas exige un identificador único y el texto; la respuesta de referencia, el idioma, la categoría y la intención son opcionales. Para el conocimiento exige un identificador y el contenido, mientras que el idioma, la categoría, la intención y la fuente son opcionales. Un archivo de mapeo permite asociar columnas propias del usuario con estos campos, y los atributos adicionales se conservan en metadata. Los adaptadores de Bitext mantienen la compatibilidad con el corpus experimental y el comando validar_datos_entrada.py informa la fila y el campo ante un error antes de ejecutar modelos o consumir APIs.</w:t>
+      </w:r>
+    </w:p>
+    <w:p>
+      <w:pPr>
         <w:spacing w:after="80"/>
         <w:ind w:left="720" w:hanging="360"/>
       </w:pPr>
       <w:r>
+        <w:lastRenderedPageBreak/>
         <w:t>• comparacion_controlada_rag.csv: comparación principal baseline-RAG.</w:t>
       </w:r>
     </w:p>
@@ -6319,7 +6374,7 @@
         <w:pStyle w:val="Ttulo2"/>
         <w:spacing w:before="280" w:after="120"/>
       </w:pPr>
-      <w:bookmarkStart w:id="63" w:name="_Toc242715191"/>
+      <w:bookmarkStart w:id="63" w:name="_Toc243143962"/>
       <w:r>
         <w:t>5.4 Verificación técnica</w:t>
       </w:r>
@@ -6331,7 +6386,7 @@
         <w:jc w:val="both"/>
       </w:pPr>
       <w:r>
-        <w:t>El smoke test local completó cuatro generaciones de dos consultas en LLaMA y Mistral. La corrida completa produjo 60 de 60 respuestas válidas en RAG y otras 60 de 60 en el baseline controlado. La suite automatizada finalizó con 27 pruebas aprobadas. Durante el smoke test, Mistral inventó un canal de correo que no estaba respaldado por el contexto; este caso confirma que RAG reduce el espacio de respuesta, pero no garantiza por sí mismo la ausencia de alucinaciones.</w:t>
+        <w:t>El smoke test local completó cuatro generaciones de dos consultas en LLaMA y Mistral. La corrida completa produjo 60 de 60 respuestas válidas en RAG y otras 60 de 60 en el baseline controlado. La suite automatizada finalizó con 60 pruebas aprobadas, incluidas siete dedicadas al esquema de entrada. Durante el smoke test, Mistral inventó un canal de correo que no estaba respaldado por el contexto; este caso confirma que RAG reduce el espacio de respuesta, pero no garantiza por sí mismo la ausencia de alucinaciones.</w:t>
       </w:r>
     </w:p>
     <w:p>
@@ -6339,7 +6394,7 @@
         <w:pStyle w:val="Ttulo2"/>
       </w:pPr>
       <w:bookmarkStart w:id="64" w:name="_kjpof9hrgtgt" w:colFirst="0" w:colLast="0"/>
-      <w:bookmarkStart w:id="65" w:name="_Toc242715192"/>
+      <w:bookmarkStart w:id="65" w:name="_Toc243143963"/>
       <w:bookmarkEnd w:id="64"/>
       <w:r>
         <w:t>5.5 Dashboard de resultados</w:t>
@@ -6364,8 +6419,9 @@
         <w:spacing w:before="400" w:after="200"/>
         <w:jc w:val="center"/>
       </w:pPr>
-      <w:bookmarkStart w:id="66" w:name="_Toc242715193"/>
-      <w:r>
+      <w:bookmarkStart w:id="66" w:name="_Toc243143964"/>
+      <w:r>
+        <w:lastRenderedPageBreak/>
         <w:t>Capítulo 6 - Experimentación y Resultados</w:t>
       </w:r>
       <w:bookmarkEnd w:id="66"/>
@@ -6381,7 +6437,7 @@
         <w:pStyle w:val="Ttulo2"/>
         <w:spacing w:before="280" w:after="120"/>
       </w:pPr>
-      <w:bookmarkStart w:id="67" w:name="_Toc242715194"/>
+      <w:bookmarkStart w:id="67" w:name="_Toc243143965"/>
       <w:r>
         <w:t>6.1 Diseño del piloto controlado</w:t>
       </w:r>
@@ -6401,7 +6457,7 @@
         <w:pStyle w:val="Ttulo2"/>
         <w:spacing w:before="280" w:after="120"/>
       </w:pPr>
-      <w:bookmarkStart w:id="68" w:name="_Toc242715195"/>
+      <w:bookmarkStart w:id="68" w:name="_Toc243143966"/>
       <w:r>
         <w:t>6.2 Rendimiento del recuperador</w:t>
       </w:r>
@@ -6913,7 +6969,7 @@
         <w:pStyle w:val="Ttulo2"/>
         <w:spacing w:before="280" w:after="120"/>
       </w:pPr>
-      <w:bookmarkStart w:id="69" w:name="_Toc242715196"/>
+      <w:bookmarkStart w:id="69" w:name="_Toc243143967"/>
       <w:r>
         <w:t>6.3 Calidad por modelo y condición</w:t>
       </w:r>
@@ -7339,7 +7395,7 @@
         <w:pStyle w:val="Ttulo2"/>
         <w:spacing w:before="280" w:after="120"/>
       </w:pPr>
-      <w:bookmarkStart w:id="70" w:name="_Toc242715197"/>
+      <w:bookmarkStart w:id="70" w:name="_Toc243143968"/>
       <w:r>
         <w:t>6.4 Latencia, tokens y costos</w:t>
       </w:r>
@@ -7877,7 +7933,11 @@
         <w:jc w:val="both"/>
       </w:pPr>
       <w:r>
-        <w:t>GPT consumió USD 0,001333 para las 20 respuestas del baseline y USD 0,002958 para las 20 con RAG. El costo por 1.000 consultas aumentó en los tres modelos. Bajo el escenario cloud seleccionado, GPT conservó el menor costo por consulta; los modelos abiertos no mostraron la ventaja económica esperada en este piloto. La sensibilidad eléctrica produjo cifras menores, pero no incluye compra, amortización, mantenimiento ni capacidad ociosa del hardware.</w:t>
+        <w:t xml:space="preserve">GPT consumió USD 0,001333 para las 20 respuestas del baseline y USD 0,002958 para las 20 con RAG. El costo por 1.000 consultas aumentó en los tres modelos. Bajo el escenario cloud seleccionado, GPT conservó el menor costo por consulta; los modelos abiertos no mostraron la </w:t>
+      </w:r>
+      <w:r>
+        <w:lastRenderedPageBreak/>
+        <w:t>ventaja económica esperada en este piloto. La sensibilidad eléctrica produjo cifras menores, pero no incluye compra, amortización, mantenimiento ni capacidad ociosa del hardware.</w:t>
       </w:r>
     </w:p>
     <w:p>
@@ -7885,7 +7945,7 @@
         <w:pStyle w:val="Ttulo2"/>
         <w:spacing w:before="280" w:after="120"/>
       </w:pPr>
-      <w:bookmarkStart w:id="71" w:name="_Toc242715198"/>
+      <w:bookmarkStart w:id="71" w:name="_Toc243143969"/>
       <w:r>
         <w:t>6.5 Aciertos de recuperación y calidad</w:t>
       </w:r>
@@ -8310,7 +8370,7 @@
       <w:pPr>
         <w:pStyle w:val="Ttulo2"/>
       </w:pPr>
-      <w:bookmarkStart w:id="72" w:name="_Toc242715199"/>
+      <w:bookmarkStart w:id="72" w:name="_Toc243143970"/>
       <w:r>
         <w:t>6.6 Discusión de las hipótesis en el piloto</w:t>
       </w:r>
@@ -8348,7 +8408,7 @@
         <w:pStyle w:val="Ttulo2"/>
         <w:spacing w:before="280" w:after="120"/>
       </w:pPr>
-      <w:bookmarkStart w:id="73" w:name="_Toc242715200"/>
+      <w:bookmarkStart w:id="73" w:name="_Toc243143971"/>
       <w:r>
         <w:t>6.7 Limitaciones del piloto</w:t>
       </w:r>
@@ -8360,6 +8420,7 @@
         <w:ind w:left="720" w:hanging="360"/>
       </w:pPr>
       <w:r>
+        <w:lastRenderedPageBreak/>
         <w:t>• La muestra de 20 consultas por configuración no permite inferencia estadística ni generalización.</w:t>
       </w:r>
     </w:p>
@@ -8422,7 +8483,7 @@
         <w:pStyle w:val="Ttulo2"/>
       </w:pPr>
       <w:bookmarkStart w:id="74" w:name="_xe7dxo5vlxj0" w:colFirst="0" w:colLast="0"/>
-      <w:bookmarkStart w:id="75" w:name="_Toc242715201"/>
+      <w:bookmarkStart w:id="75" w:name="_Toc243143972"/>
       <w:bookmarkEnd w:id="74"/>
       <w:r>
         <w:t>6.8 Experimento ampliado y visualización de resultados</w:t>
@@ -8505,6 +8566,7 @@
                 <w:i w:val="0"/>
                 <w:color w:val="000000"/>
               </w:rPr>
+              <w:lastRenderedPageBreak/>
               <w:t>Tabla 6</w:t>
             </w:r>
             <w:r>
@@ -8901,6 +8963,7 @@
                 <w:color w:val="000000"/>
                 <w:sz w:val="17"/>
               </w:rPr>
+              <w:lastRenderedPageBreak/>
               <w:t>LLaMA 3.1 8B</w:t>
             </w:r>
           </w:p>
@@ -9080,6 +9143,7 @@
                 <w:color w:val="000000"/>
                 <w:sz w:val="17"/>
               </w:rPr>
+              <w:lastRenderedPageBreak/>
               <w:t>Mistral</w:t>
             </w:r>
           </w:p>
@@ -9337,7 +9401,11 @@
     </w:p>
     <w:p>
       <w:r>
-        <w:t>La Figura 2 permite observar que el efecto de RAG es positivo para ambas métricas en los tres modelos. Los incrementos medios de BERTScore fueron 0,0357 para GPT-4o mini, 0,0274 para LLaMA y 0,0322 para Mistral. En ROUGE-L, los aumentos fueron 0,0739, 0,0496 y 0,0552, respectivamente.</w:t>
+        <w:t xml:space="preserve">La Figura 2 permite observar que el efecto de RAG es positivo para ambas métricas en los tres modelos. Los incrementos medios de BERTScore fueron 0,0357 para GPT-4o mini, 0,0274 para </w:t>
+      </w:r>
+      <w:r>
+        <w:lastRenderedPageBreak/>
+        <w:t>LLaMA y 0,0322 para Mistral. En ROUGE-L, los aumentos fueron 0,0739, 0,0496 y 0,0552, respectivamente.</w:t>
       </w:r>
     </w:p>
     <w:p/>
@@ -9460,6 +9528,7 @@
           <w:i w:val="0"/>
           <w:color w:val="000000"/>
         </w:rPr>
+        <w:lastRenderedPageBreak/>
         <w:t>Figura 3</w:t>
       </w:r>
       <w:r>
@@ -9556,8 +9625,9 @@
         <w:spacing w:before="400" w:after="200"/>
         <w:jc w:val="center"/>
       </w:pPr>
-      <w:bookmarkStart w:id="76" w:name="_Toc242715202"/>
-      <w:r>
+      <w:bookmarkStart w:id="76" w:name="_Toc243143973"/>
+      <w:r>
+        <w:lastRenderedPageBreak/>
         <w:t>Conclusiones</w:t>
       </w:r>
       <w:bookmarkEnd w:id="76"/>
@@ -9595,8 +9665,9 @@
         <w:spacing w:before="400" w:after="200"/>
         <w:jc w:val="center"/>
       </w:pPr>
-      <w:bookmarkStart w:id="78" w:name="_Toc242715203"/>
-      <w:r>
+      <w:bookmarkStart w:id="78" w:name="_Toc243143974"/>
+      <w:r>
+        <w:lastRenderedPageBreak/>
         <w:t>Líneas Futuras de Investigación</w:t>
       </w:r>
       <w:bookmarkEnd w:id="78"/>
@@ -9646,8 +9717,9 @@
         <w:spacing w:before="400" w:after="200"/>
         <w:jc w:val="center"/>
       </w:pPr>
-      <w:bookmarkStart w:id="80" w:name="_Toc242715204"/>
-      <w:r>
+      <w:bookmarkStart w:id="80" w:name="_Toc243143975"/>
+      <w:r>
+        <w:lastRenderedPageBreak/>
         <w:t>Referencias</w:t>
       </w:r>
       <w:bookmarkEnd w:id="80"/>
@@ -9771,6 +9843,7 @@
         <w:rPr>
           <w:sz w:val="20"/>
         </w:rPr>
+        <w:lastRenderedPageBreak/>
         <w:t>Garzón-Quiroz, M., Del Campo-Saltos, G., y Loor-Ávila, B. (2025). Análisis sistemático sobre la eficiencia comunicativa entre chatbots basados en reglas y modelos de lenguaje natural. Universitas-XXI, Revista de Ciencias Sociales y Humanas, 42, 167-192. https://doi.org/10.17163/uni.n42.2025.07</w:t>
       </w:r>
     </w:p>
@@ -9907,6 +9980,7 @@
         <w:ind w:left="432" w:hanging="432"/>
       </w:pPr>
       <w:r>
+        <w:lastRenderedPageBreak/>
         <w:t>Saad-Falcon, J., Khattab, O., Potts, C., y Zaharia, M. (2024). ARES: An automated evaluation framework for retrieval-augmented generation systems. En Proceedings of the 2024 Conference of the North American Chapter of the Association for Computational Linguistics: Human Language Technologies (Volume 1: Long Papers) (pp. 338-354). Association for Computational Linguistics. https://doi.org/10.18653/v1/2024.naacl-long.20</w:t>
       </w:r>
     </w:p>
@@ -10010,9 +10084,10 @@
         <w:jc w:val="center"/>
       </w:pPr>
       <w:bookmarkStart w:id="81" w:name="_1q0j1q3m5z1k" w:colFirst="0" w:colLast="0"/>
-      <w:bookmarkStart w:id="82" w:name="_Toc242715205"/>
+      <w:bookmarkStart w:id="82" w:name="_Toc243143976"/>
       <w:bookmarkEnd w:id="81"/>
       <w:r>
+        <w:lastRenderedPageBreak/>
         <w:t>Anexos y Acrónimos</w:t>
       </w:r>
       <w:bookmarkEnd w:id="82"/>

</xml_diff>

<commit_message>
feat: integra el esquema v1 con el pipeline de datos propios
</commit_message>
<xml_diff>
--- a/proyecto/TF_Juan_Bautista_Xifro_2026.docx
+++ b/proyecto/TF_Juan_Bautista_Xifro_2026.docx
@@ -227,7 +227,7 @@
         <w:jc w:val="center"/>
       </w:pPr>
       <w:bookmarkStart w:id="0" w:name="_c0e28rqma0nq" w:colFirst="0" w:colLast="0"/>
-      <w:bookmarkStart w:id="1" w:name="_Toc243143922"/>
+      <w:bookmarkStart w:id="1" w:name="_Toc243151140"/>
       <w:bookmarkEnd w:id="0"/>
       <w:r>
         <w:lastRenderedPageBreak/>
@@ -259,7 +259,7 @@
       <w:r>
         <w:fldChar w:fldCharType="separate"/>
       </w:r>
-      <w:hyperlink w:anchor="_Toc243143922" w:history="1">
+      <w:hyperlink w:anchor="_Toc243151140" w:history="1">
         <w:r>
           <w:rPr>
             <w:rStyle w:val="Hipervnculo"/>
@@ -286,7 +286,7 @@
             <w:noProof/>
             <w:webHidden/>
           </w:rPr>
-          <w:instrText xml:space="preserve"> PAGEREF _Toc243143922 \h </w:instrText>
+          <w:instrText xml:space="preserve"> PAGEREF _Toc243151140 \h </w:instrText>
         </w:r>
         <w:r>
           <w:rPr>
@@ -330,7 +330,7 @@
           <w14:ligatures w14:val="standardContextual"/>
         </w:rPr>
       </w:pPr>
-      <w:hyperlink w:anchor="_Toc243143923" w:history="1">
+      <w:hyperlink w:anchor="_Toc243151141" w:history="1">
         <w:r>
           <w:rPr>
             <w:rStyle w:val="Hipervnculo"/>
@@ -357,7 +357,7 @@
             <w:noProof/>
             <w:webHidden/>
           </w:rPr>
-          <w:instrText xml:space="preserve"> PAGEREF _Toc243143923 \h </w:instrText>
+          <w:instrText xml:space="preserve"> PAGEREF _Toc243151141 \h </w:instrText>
         </w:r>
         <w:r>
           <w:rPr>
@@ -401,7 +401,7 @@
           <w14:ligatures w14:val="standardContextual"/>
         </w:rPr>
       </w:pPr>
-      <w:hyperlink w:anchor="_Toc243143924" w:history="1">
+      <w:hyperlink w:anchor="_Toc243151142" w:history="1">
         <w:r>
           <w:rPr>
             <w:rStyle w:val="Hipervnculo"/>
@@ -428,7 +428,7 @@
             <w:noProof/>
             <w:webHidden/>
           </w:rPr>
-          <w:instrText xml:space="preserve"> PAGEREF _Toc243143924 \h </w:instrText>
+          <w:instrText xml:space="preserve"> PAGEREF _Toc243151142 \h </w:instrText>
         </w:r>
         <w:r>
           <w:rPr>
@@ -472,7 +472,7 @@
           <w14:ligatures w14:val="standardContextual"/>
         </w:rPr>
       </w:pPr>
-      <w:hyperlink w:anchor="_Toc243143925" w:history="1">
+      <w:hyperlink w:anchor="_Toc243151143" w:history="1">
         <w:r>
           <w:rPr>
             <w:rStyle w:val="Hipervnculo"/>
@@ -499,7 +499,7 @@
             <w:noProof/>
             <w:webHidden/>
           </w:rPr>
-          <w:instrText xml:space="preserve"> PAGEREF _Toc243143925 \h </w:instrText>
+          <w:instrText xml:space="preserve"> PAGEREF _Toc243151143 \h </w:instrText>
         </w:r>
         <w:r>
           <w:rPr>
@@ -543,7 +543,7 @@
           <w14:ligatures w14:val="standardContextual"/>
         </w:rPr>
       </w:pPr>
-      <w:hyperlink w:anchor="_Toc243143926" w:history="1">
+      <w:hyperlink w:anchor="_Toc243151144" w:history="1">
         <w:r>
           <w:rPr>
             <w:rStyle w:val="Hipervnculo"/>
@@ -570,7 +570,7 @@
             <w:noProof/>
             <w:webHidden/>
           </w:rPr>
-          <w:instrText xml:space="preserve"> PAGEREF _Toc243143926 \h </w:instrText>
+          <w:instrText xml:space="preserve"> PAGEREF _Toc243151144 \h </w:instrText>
         </w:r>
         <w:r>
           <w:rPr>
@@ -614,7 +614,7 @@
           <w14:ligatures w14:val="standardContextual"/>
         </w:rPr>
       </w:pPr>
-      <w:hyperlink w:anchor="_Toc243143927" w:history="1">
+      <w:hyperlink w:anchor="_Toc243151145" w:history="1">
         <w:r>
           <w:rPr>
             <w:rStyle w:val="Hipervnculo"/>
@@ -641,7 +641,7 @@
             <w:noProof/>
             <w:webHidden/>
           </w:rPr>
-          <w:instrText xml:space="preserve"> PAGEREF _Toc243143927 \h </w:instrText>
+          <w:instrText xml:space="preserve"> PAGEREF _Toc243151145 \h </w:instrText>
         </w:r>
         <w:r>
           <w:rPr>
@@ -685,7 +685,7 @@
           <w14:ligatures w14:val="standardContextual"/>
         </w:rPr>
       </w:pPr>
-      <w:hyperlink w:anchor="_Toc243143928" w:history="1">
+      <w:hyperlink w:anchor="_Toc243151146" w:history="1">
         <w:r>
           <w:rPr>
             <w:rStyle w:val="Hipervnculo"/>
@@ -712,7 +712,7 @@
             <w:noProof/>
             <w:webHidden/>
           </w:rPr>
-          <w:instrText xml:space="preserve"> PAGEREF _Toc243143928 \h </w:instrText>
+          <w:instrText xml:space="preserve"> PAGEREF _Toc243151146 \h </w:instrText>
         </w:r>
         <w:r>
           <w:rPr>
@@ -756,7 +756,7 @@
           <w14:ligatures w14:val="standardContextual"/>
         </w:rPr>
       </w:pPr>
-      <w:hyperlink w:anchor="_Toc243143929" w:history="1">
+      <w:hyperlink w:anchor="_Toc243151147" w:history="1">
         <w:r>
           <w:rPr>
             <w:rStyle w:val="Hipervnculo"/>
@@ -783,7 +783,7 @@
             <w:noProof/>
             <w:webHidden/>
           </w:rPr>
-          <w:instrText xml:space="preserve"> PAGEREF _Toc243143929 \h </w:instrText>
+          <w:instrText xml:space="preserve"> PAGEREF _Toc243151147 \h </w:instrText>
         </w:r>
         <w:r>
           <w:rPr>
@@ -827,7 +827,7 @@
           <w14:ligatures w14:val="standardContextual"/>
         </w:rPr>
       </w:pPr>
-      <w:hyperlink w:anchor="_Toc243143930" w:history="1">
+      <w:hyperlink w:anchor="_Toc243151148" w:history="1">
         <w:r>
           <w:rPr>
             <w:rStyle w:val="Hipervnculo"/>
@@ -854,7 +854,7 @@
             <w:noProof/>
             <w:webHidden/>
           </w:rPr>
-          <w:instrText xml:space="preserve"> PAGEREF _Toc243143930 \h </w:instrText>
+          <w:instrText xml:space="preserve"> PAGEREF _Toc243151148 \h </w:instrText>
         </w:r>
         <w:r>
           <w:rPr>
@@ -898,7 +898,7 @@
           <w14:ligatures w14:val="standardContextual"/>
         </w:rPr>
       </w:pPr>
-      <w:hyperlink w:anchor="_Toc243143931" w:history="1">
+      <w:hyperlink w:anchor="_Toc243151149" w:history="1">
         <w:r>
           <w:rPr>
             <w:rStyle w:val="Hipervnculo"/>
@@ -925,7 +925,7 @@
             <w:noProof/>
             <w:webHidden/>
           </w:rPr>
-          <w:instrText xml:space="preserve"> PAGEREF _Toc243143931 \h </w:instrText>
+          <w:instrText xml:space="preserve"> PAGEREF _Toc243151149 \h </w:instrText>
         </w:r>
         <w:r>
           <w:rPr>
@@ -969,7 +969,7 @@
           <w14:ligatures w14:val="standardContextual"/>
         </w:rPr>
       </w:pPr>
-      <w:hyperlink w:anchor="_Toc243143932" w:history="1">
+      <w:hyperlink w:anchor="_Toc243151150" w:history="1">
         <w:r>
           <w:rPr>
             <w:rStyle w:val="Hipervnculo"/>
@@ -996,7 +996,7 @@
             <w:noProof/>
             <w:webHidden/>
           </w:rPr>
-          <w:instrText xml:space="preserve"> PAGEREF _Toc243143932 \h </w:instrText>
+          <w:instrText xml:space="preserve"> PAGEREF _Toc243151150 \h </w:instrText>
         </w:r>
         <w:r>
           <w:rPr>
@@ -1040,7 +1040,7 @@
           <w14:ligatures w14:val="standardContextual"/>
         </w:rPr>
       </w:pPr>
-      <w:hyperlink w:anchor="_Toc243143933" w:history="1">
+      <w:hyperlink w:anchor="_Toc243151151" w:history="1">
         <w:r>
           <w:rPr>
             <w:rStyle w:val="Hipervnculo"/>
@@ -1067,7 +1067,7 @@
             <w:noProof/>
             <w:webHidden/>
           </w:rPr>
-          <w:instrText xml:space="preserve"> PAGEREF _Toc243143933 \h </w:instrText>
+          <w:instrText xml:space="preserve"> PAGEREF _Toc243151151 \h </w:instrText>
         </w:r>
         <w:r>
           <w:rPr>
@@ -1111,7 +1111,7 @@
           <w14:ligatures w14:val="standardContextual"/>
         </w:rPr>
       </w:pPr>
-      <w:hyperlink w:anchor="_Toc243143934" w:history="1">
+      <w:hyperlink w:anchor="_Toc243151152" w:history="1">
         <w:r>
           <w:rPr>
             <w:rStyle w:val="Hipervnculo"/>
@@ -1138,7 +1138,7 @@
             <w:noProof/>
             <w:webHidden/>
           </w:rPr>
-          <w:instrText xml:space="preserve"> PAGEREF _Toc243143934 \h </w:instrText>
+          <w:instrText xml:space="preserve"> PAGEREF _Toc243151152 \h </w:instrText>
         </w:r>
         <w:r>
           <w:rPr>
@@ -1182,7 +1182,7 @@
           <w14:ligatures w14:val="standardContextual"/>
         </w:rPr>
       </w:pPr>
-      <w:hyperlink w:anchor="_Toc243143935" w:history="1">
+      <w:hyperlink w:anchor="_Toc243151153" w:history="1">
         <w:r>
           <w:rPr>
             <w:rStyle w:val="Hipervnculo"/>
@@ -1209,7 +1209,7 @@
             <w:noProof/>
             <w:webHidden/>
           </w:rPr>
-          <w:instrText xml:space="preserve"> PAGEREF _Toc243143935 \h </w:instrText>
+          <w:instrText xml:space="preserve"> PAGEREF _Toc243151153 \h </w:instrText>
         </w:r>
         <w:r>
           <w:rPr>
@@ -1253,7 +1253,7 @@
           <w14:ligatures w14:val="standardContextual"/>
         </w:rPr>
       </w:pPr>
-      <w:hyperlink w:anchor="_Toc243143936" w:history="1">
+      <w:hyperlink w:anchor="_Toc243151154" w:history="1">
         <w:r>
           <w:rPr>
             <w:rStyle w:val="Hipervnculo"/>
@@ -1280,7 +1280,7 @@
             <w:noProof/>
             <w:webHidden/>
           </w:rPr>
-          <w:instrText xml:space="preserve"> PAGEREF _Toc243143936 \h </w:instrText>
+          <w:instrText xml:space="preserve"> PAGEREF _Toc243151154 \h </w:instrText>
         </w:r>
         <w:r>
           <w:rPr>
@@ -1324,7 +1324,7 @@
           <w14:ligatures w14:val="standardContextual"/>
         </w:rPr>
       </w:pPr>
-      <w:hyperlink w:anchor="_Toc243143937" w:history="1">
+      <w:hyperlink w:anchor="_Toc243151155" w:history="1">
         <w:r>
           <w:rPr>
             <w:rStyle w:val="Hipervnculo"/>
@@ -1351,7 +1351,7 @@
             <w:noProof/>
             <w:webHidden/>
           </w:rPr>
-          <w:instrText xml:space="preserve"> PAGEREF _Toc243143937 \h </w:instrText>
+          <w:instrText xml:space="preserve"> PAGEREF _Toc243151155 \h </w:instrText>
         </w:r>
         <w:r>
           <w:rPr>
@@ -1395,7 +1395,7 @@
           <w14:ligatures w14:val="standardContextual"/>
         </w:rPr>
       </w:pPr>
-      <w:hyperlink w:anchor="_Toc243143938" w:history="1">
+      <w:hyperlink w:anchor="_Toc243151156" w:history="1">
         <w:r>
           <w:rPr>
             <w:rStyle w:val="Hipervnculo"/>
@@ -1422,7 +1422,7 @@
             <w:noProof/>
             <w:webHidden/>
           </w:rPr>
-          <w:instrText xml:space="preserve"> PAGEREF _Toc243143938 \h </w:instrText>
+          <w:instrText xml:space="preserve"> PAGEREF _Toc243151156 \h </w:instrText>
         </w:r>
         <w:r>
           <w:rPr>
@@ -1466,7 +1466,7 @@
           <w14:ligatures w14:val="standardContextual"/>
         </w:rPr>
       </w:pPr>
-      <w:hyperlink w:anchor="_Toc243143939" w:history="1">
+      <w:hyperlink w:anchor="_Toc243151157" w:history="1">
         <w:r>
           <w:rPr>
             <w:rStyle w:val="Hipervnculo"/>
@@ -1493,7 +1493,7 @@
             <w:noProof/>
             <w:webHidden/>
           </w:rPr>
-          <w:instrText xml:space="preserve"> PAGEREF _Toc243143939 \h </w:instrText>
+          <w:instrText xml:space="preserve"> PAGEREF _Toc243151157 \h </w:instrText>
         </w:r>
         <w:r>
           <w:rPr>
@@ -1537,7 +1537,7 @@
           <w14:ligatures w14:val="standardContextual"/>
         </w:rPr>
       </w:pPr>
-      <w:hyperlink w:anchor="_Toc243143940" w:history="1">
+      <w:hyperlink w:anchor="_Toc243151158" w:history="1">
         <w:r>
           <w:rPr>
             <w:rStyle w:val="Hipervnculo"/>
@@ -1564,7 +1564,7 @@
             <w:noProof/>
             <w:webHidden/>
           </w:rPr>
-          <w:instrText xml:space="preserve"> PAGEREF _Toc243143940 \h </w:instrText>
+          <w:instrText xml:space="preserve"> PAGEREF _Toc243151158 \h </w:instrText>
         </w:r>
         <w:r>
           <w:rPr>
@@ -1608,7 +1608,7 @@
           <w14:ligatures w14:val="standardContextual"/>
         </w:rPr>
       </w:pPr>
-      <w:hyperlink w:anchor="_Toc243143941" w:history="1">
+      <w:hyperlink w:anchor="_Toc243151159" w:history="1">
         <w:r>
           <w:rPr>
             <w:rStyle w:val="Hipervnculo"/>
@@ -1635,7 +1635,7 @@
             <w:noProof/>
             <w:webHidden/>
           </w:rPr>
-          <w:instrText xml:space="preserve"> PAGEREF _Toc243143941 \h </w:instrText>
+          <w:instrText xml:space="preserve"> PAGEREF _Toc243151159 \h </w:instrText>
         </w:r>
         <w:r>
           <w:rPr>
@@ -1679,7 +1679,7 @@
           <w14:ligatures w14:val="standardContextual"/>
         </w:rPr>
       </w:pPr>
-      <w:hyperlink w:anchor="_Toc243143942" w:history="1">
+      <w:hyperlink w:anchor="_Toc243151160" w:history="1">
         <w:r>
           <w:rPr>
             <w:rStyle w:val="Hipervnculo"/>
@@ -1706,7 +1706,7 @@
             <w:noProof/>
             <w:webHidden/>
           </w:rPr>
-          <w:instrText xml:space="preserve"> PAGEREF _Toc243143942 \h </w:instrText>
+          <w:instrText xml:space="preserve"> PAGEREF _Toc243151160 \h </w:instrText>
         </w:r>
         <w:r>
           <w:rPr>
@@ -1750,7 +1750,7 @@
           <w14:ligatures w14:val="standardContextual"/>
         </w:rPr>
       </w:pPr>
-      <w:hyperlink w:anchor="_Toc243143943" w:history="1">
+      <w:hyperlink w:anchor="_Toc243151161" w:history="1">
         <w:r>
           <w:rPr>
             <w:rStyle w:val="Hipervnculo"/>
@@ -1777,7 +1777,7 @@
             <w:noProof/>
             <w:webHidden/>
           </w:rPr>
-          <w:instrText xml:space="preserve"> PAGEREF _Toc243143943 \h </w:instrText>
+          <w:instrText xml:space="preserve"> PAGEREF _Toc243151161 \h </w:instrText>
         </w:r>
         <w:r>
           <w:rPr>
@@ -1821,7 +1821,7 @@
           <w14:ligatures w14:val="standardContextual"/>
         </w:rPr>
       </w:pPr>
-      <w:hyperlink w:anchor="_Toc243143944" w:history="1">
+      <w:hyperlink w:anchor="_Toc243151162" w:history="1">
         <w:r>
           <w:rPr>
             <w:rStyle w:val="Hipervnculo"/>
@@ -1848,7 +1848,7 @@
             <w:noProof/>
             <w:webHidden/>
           </w:rPr>
-          <w:instrText xml:space="preserve"> PAGEREF _Toc243143944 \h </w:instrText>
+          <w:instrText xml:space="preserve"> PAGEREF _Toc243151162 \h </w:instrText>
         </w:r>
         <w:r>
           <w:rPr>
@@ -1892,7 +1892,7 @@
           <w14:ligatures w14:val="standardContextual"/>
         </w:rPr>
       </w:pPr>
-      <w:hyperlink w:anchor="_Toc243143945" w:history="1">
+      <w:hyperlink w:anchor="_Toc243151163" w:history="1">
         <w:r>
           <w:rPr>
             <w:rStyle w:val="Hipervnculo"/>
@@ -1919,7 +1919,7 @@
             <w:noProof/>
             <w:webHidden/>
           </w:rPr>
-          <w:instrText xml:space="preserve"> PAGEREF _Toc243143945 \h </w:instrText>
+          <w:instrText xml:space="preserve"> PAGEREF _Toc243151163 \h </w:instrText>
         </w:r>
         <w:r>
           <w:rPr>
@@ -1963,7 +1963,7 @@
           <w14:ligatures w14:val="standardContextual"/>
         </w:rPr>
       </w:pPr>
-      <w:hyperlink w:anchor="_Toc243143946" w:history="1">
+      <w:hyperlink w:anchor="_Toc243151164" w:history="1">
         <w:r>
           <w:rPr>
             <w:rStyle w:val="Hipervnculo"/>
@@ -1990,7 +1990,7 @@
             <w:noProof/>
             <w:webHidden/>
           </w:rPr>
-          <w:instrText xml:space="preserve"> PAGEREF _Toc243143946 \h </w:instrText>
+          <w:instrText xml:space="preserve"> PAGEREF _Toc243151164 \h </w:instrText>
         </w:r>
         <w:r>
           <w:rPr>
@@ -2034,7 +2034,7 @@
           <w14:ligatures w14:val="standardContextual"/>
         </w:rPr>
       </w:pPr>
-      <w:hyperlink w:anchor="_Toc243143947" w:history="1">
+      <w:hyperlink w:anchor="_Toc243151165" w:history="1">
         <w:r>
           <w:rPr>
             <w:rStyle w:val="Hipervnculo"/>
@@ -2061,7 +2061,7 @@
             <w:noProof/>
             <w:webHidden/>
           </w:rPr>
-          <w:instrText xml:space="preserve"> PAGEREF _Toc243143947 \h </w:instrText>
+          <w:instrText xml:space="preserve"> PAGEREF _Toc243151165 \h </w:instrText>
         </w:r>
         <w:r>
           <w:rPr>
@@ -2105,7 +2105,7 @@
           <w14:ligatures w14:val="standardContextual"/>
         </w:rPr>
       </w:pPr>
-      <w:hyperlink w:anchor="_Toc243143948" w:history="1">
+      <w:hyperlink w:anchor="_Toc243151166" w:history="1">
         <w:r>
           <w:rPr>
             <w:rStyle w:val="Hipervnculo"/>
@@ -2132,7 +2132,7 @@
             <w:noProof/>
             <w:webHidden/>
           </w:rPr>
-          <w:instrText xml:space="preserve"> PAGEREF _Toc243143948 \h </w:instrText>
+          <w:instrText xml:space="preserve"> PAGEREF _Toc243151166 \h </w:instrText>
         </w:r>
         <w:r>
           <w:rPr>
@@ -2176,7 +2176,7 @@
           <w14:ligatures w14:val="standardContextual"/>
         </w:rPr>
       </w:pPr>
-      <w:hyperlink w:anchor="_Toc243143949" w:history="1">
+      <w:hyperlink w:anchor="_Toc243151167" w:history="1">
         <w:r>
           <w:rPr>
             <w:rStyle w:val="Hipervnculo"/>
@@ -2203,7 +2203,7 @@
             <w:noProof/>
             <w:webHidden/>
           </w:rPr>
-          <w:instrText xml:space="preserve"> PAGEREF _Toc243143949 \h </w:instrText>
+          <w:instrText xml:space="preserve"> PAGEREF _Toc243151167 \h </w:instrText>
         </w:r>
         <w:r>
           <w:rPr>
@@ -2247,7 +2247,7 @@
           <w14:ligatures w14:val="standardContextual"/>
         </w:rPr>
       </w:pPr>
-      <w:hyperlink w:anchor="_Toc243143950" w:history="1">
+      <w:hyperlink w:anchor="_Toc243151168" w:history="1">
         <w:r>
           <w:rPr>
             <w:rStyle w:val="Hipervnculo"/>
@@ -2274,7 +2274,7 @@
             <w:noProof/>
             <w:webHidden/>
           </w:rPr>
-          <w:instrText xml:space="preserve"> PAGEREF _Toc243143950 \h </w:instrText>
+          <w:instrText xml:space="preserve"> PAGEREF _Toc243151168 \h </w:instrText>
         </w:r>
         <w:r>
           <w:rPr>
@@ -2318,7 +2318,7 @@
           <w14:ligatures w14:val="standardContextual"/>
         </w:rPr>
       </w:pPr>
-      <w:hyperlink w:anchor="_Toc243143951" w:history="1">
+      <w:hyperlink w:anchor="_Toc243151169" w:history="1">
         <w:r>
           <w:rPr>
             <w:rStyle w:val="Hipervnculo"/>
@@ -2345,7 +2345,7 @@
             <w:noProof/>
             <w:webHidden/>
           </w:rPr>
-          <w:instrText xml:space="preserve"> PAGEREF _Toc243143951 \h </w:instrText>
+          <w:instrText xml:space="preserve"> PAGEREF _Toc243151169 \h </w:instrText>
         </w:r>
         <w:r>
           <w:rPr>
@@ -2389,7 +2389,7 @@
           <w14:ligatures w14:val="standardContextual"/>
         </w:rPr>
       </w:pPr>
-      <w:hyperlink w:anchor="_Toc243143952" w:history="1">
+      <w:hyperlink w:anchor="_Toc243151170" w:history="1">
         <w:r>
           <w:rPr>
             <w:rStyle w:val="Hipervnculo"/>
@@ -2416,7 +2416,7 @@
             <w:noProof/>
             <w:webHidden/>
           </w:rPr>
-          <w:instrText xml:space="preserve"> PAGEREF _Toc243143952 \h </w:instrText>
+          <w:instrText xml:space="preserve"> PAGEREF _Toc243151170 \h </w:instrText>
         </w:r>
         <w:r>
           <w:rPr>
@@ -2460,7 +2460,7 @@
           <w14:ligatures w14:val="standardContextual"/>
         </w:rPr>
       </w:pPr>
-      <w:hyperlink w:anchor="_Toc243143953" w:history="1">
+      <w:hyperlink w:anchor="_Toc243151171" w:history="1">
         <w:r>
           <w:rPr>
             <w:rStyle w:val="Hipervnculo"/>
@@ -2487,7 +2487,7 @@
             <w:noProof/>
             <w:webHidden/>
           </w:rPr>
-          <w:instrText xml:space="preserve"> PAGEREF _Toc243143953 \h </w:instrText>
+          <w:instrText xml:space="preserve"> PAGEREF _Toc243151171 \h </w:instrText>
         </w:r>
         <w:r>
           <w:rPr>
@@ -2531,7 +2531,7 @@
           <w14:ligatures w14:val="standardContextual"/>
         </w:rPr>
       </w:pPr>
-      <w:hyperlink w:anchor="_Toc243143954" w:history="1">
+      <w:hyperlink w:anchor="_Toc243151172" w:history="1">
         <w:r>
           <w:rPr>
             <w:rStyle w:val="Hipervnculo"/>
@@ -2558,7 +2558,7 @@
             <w:noProof/>
             <w:webHidden/>
           </w:rPr>
-          <w:instrText xml:space="preserve"> PAGEREF _Toc243143954 \h </w:instrText>
+          <w:instrText xml:space="preserve"> PAGEREF _Toc243151172 \h </w:instrText>
         </w:r>
         <w:r>
           <w:rPr>
@@ -2602,7 +2602,7 @@
           <w14:ligatures w14:val="standardContextual"/>
         </w:rPr>
       </w:pPr>
-      <w:hyperlink w:anchor="_Toc243143955" w:history="1">
+      <w:hyperlink w:anchor="_Toc243151173" w:history="1">
         <w:r>
           <w:rPr>
             <w:rStyle w:val="Hipervnculo"/>
@@ -2629,7 +2629,7 @@
             <w:noProof/>
             <w:webHidden/>
           </w:rPr>
-          <w:instrText xml:space="preserve"> PAGEREF _Toc243143955 \h </w:instrText>
+          <w:instrText xml:space="preserve"> PAGEREF _Toc243151173 \h </w:instrText>
         </w:r>
         <w:r>
           <w:rPr>
@@ -2673,7 +2673,7 @@
           <w14:ligatures w14:val="standardContextual"/>
         </w:rPr>
       </w:pPr>
-      <w:hyperlink w:anchor="_Toc243143956" w:history="1">
+      <w:hyperlink w:anchor="_Toc243151174" w:history="1">
         <w:r>
           <w:rPr>
             <w:rStyle w:val="Hipervnculo"/>
@@ -2700,7 +2700,7 @@
             <w:noProof/>
             <w:webHidden/>
           </w:rPr>
-          <w:instrText xml:space="preserve"> PAGEREF _Toc243143956 \h </w:instrText>
+          <w:instrText xml:space="preserve"> PAGEREF _Toc243151174 \h </w:instrText>
         </w:r>
         <w:r>
           <w:rPr>
@@ -2744,7 +2744,7 @@
           <w14:ligatures w14:val="standardContextual"/>
         </w:rPr>
       </w:pPr>
-      <w:hyperlink w:anchor="_Toc243143957" w:history="1">
+      <w:hyperlink w:anchor="_Toc243151175" w:history="1">
         <w:r>
           <w:rPr>
             <w:rStyle w:val="Hipervnculo"/>
@@ -2771,7 +2771,7 @@
             <w:noProof/>
             <w:webHidden/>
           </w:rPr>
-          <w:instrText xml:space="preserve"> PAGEREF _Toc243143957 \h </w:instrText>
+          <w:instrText xml:space="preserve"> PAGEREF _Toc243151175 \h </w:instrText>
         </w:r>
         <w:r>
           <w:rPr>
@@ -2815,7 +2815,7 @@
           <w14:ligatures w14:val="standardContextual"/>
         </w:rPr>
       </w:pPr>
-      <w:hyperlink w:anchor="_Toc243143958" w:history="1">
+      <w:hyperlink w:anchor="_Toc243151176" w:history="1">
         <w:r>
           <w:rPr>
             <w:rStyle w:val="Hipervnculo"/>
@@ -2842,7 +2842,7 @@
             <w:noProof/>
             <w:webHidden/>
           </w:rPr>
-          <w:instrText xml:space="preserve"> PAGEREF _Toc243143958 \h </w:instrText>
+          <w:instrText xml:space="preserve"> PAGEREF _Toc243151176 \h </w:instrText>
         </w:r>
         <w:r>
           <w:rPr>
@@ -2886,7 +2886,7 @@
           <w14:ligatures w14:val="standardContextual"/>
         </w:rPr>
       </w:pPr>
-      <w:hyperlink w:anchor="_Toc243143959" w:history="1">
+      <w:hyperlink w:anchor="_Toc243151177" w:history="1">
         <w:r>
           <w:rPr>
             <w:rStyle w:val="Hipervnculo"/>
@@ -2913,7 +2913,7 @@
             <w:noProof/>
             <w:webHidden/>
           </w:rPr>
-          <w:instrText xml:space="preserve"> PAGEREF _Toc243143959 \h </w:instrText>
+          <w:instrText xml:space="preserve"> PAGEREF _Toc243151177 \h </w:instrText>
         </w:r>
         <w:r>
           <w:rPr>
@@ -2957,7 +2957,7 @@
           <w14:ligatures w14:val="standardContextual"/>
         </w:rPr>
       </w:pPr>
-      <w:hyperlink w:anchor="_Toc243143960" w:history="1">
+      <w:hyperlink w:anchor="_Toc243151178" w:history="1">
         <w:r>
           <w:rPr>
             <w:rStyle w:val="Hipervnculo"/>
@@ -2984,7 +2984,7 @@
             <w:noProof/>
             <w:webHidden/>
           </w:rPr>
-          <w:instrText xml:space="preserve"> PAGEREF _Toc243143960 \h </w:instrText>
+          <w:instrText xml:space="preserve"> PAGEREF _Toc243151178 \h </w:instrText>
         </w:r>
         <w:r>
           <w:rPr>
@@ -3028,7 +3028,7 @@
           <w14:ligatures w14:val="standardContextual"/>
         </w:rPr>
       </w:pPr>
-      <w:hyperlink w:anchor="_Toc243143961" w:history="1">
+      <w:hyperlink w:anchor="_Toc243151179" w:history="1">
         <w:r>
           <w:rPr>
             <w:rStyle w:val="Hipervnculo"/>
@@ -3055,7 +3055,7 @@
             <w:noProof/>
             <w:webHidden/>
           </w:rPr>
-          <w:instrText xml:space="preserve"> PAGEREF _Toc243143961 \h </w:instrText>
+          <w:instrText xml:space="preserve"> PAGEREF _Toc243151179 \h </w:instrText>
         </w:r>
         <w:r>
           <w:rPr>
@@ -3099,7 +3099,7 @@
           <w14:ligatures w14:val="standardContextual"/>
         </w:rPr>
       </w:pPr>
-      <w:hyperlink w:anchor="_Toc243143962" w:history="1">
+      <w:hyperlink w:anchor="_Toc243151180" w:history="1">
         <w:r>
           <w:rPr>
             <w:rStyle w:val="Hipervnculo"/>
@@ -3126,7 +3126,7 @@
             <w:noProof/>
             <w:webHidden/>
           </w:rPr>
-          <w:instrText xml:space="preserve"> PAGEREF _Toc243143962 \h </w:instrText>
+          <w:instrText xml:space="preserve"> PAGEREF _Toc243151180 \h </w:instrText>
         </w:r>
         <w:r>
           <w:rPr>
@@ -3170,7 +3170,7 @@
           <w14:ligatures w14:val="standardContextual"/>
         </w:rPr>
       </w:pPr>
-      <w:hyperlink w:anchor="_Toc243143963" w:history="1">
+      <w:hyperlink w:anchor="_Toc243151181" w:history="1">
         <w:r>
           <w:rPr>
             <w:rStyle w:val="Hipervnculo"/>
@@ -3197,7 +3197,7 @@
             <w:noProof/>
             <w:webHidden/>
           </w:rPr>
-          <w:instrText xml:space="preserve"> PAGEREF _Toc243143963 \h </w:instrText>
+          <w:instrText xml:space="preserve"> PAGEREF _Toc243151181 \h </w:instrText>
         </w:r>
         <w:r>
           <w:rPr>
@@ -3241,7 +3241,7 @@
           <w14:ligatures w14:val="standardContextual"/>
         </w:rPr>
       </w:pPr>
-      <w:hyperlink w:anchor="_Toc243143964" w:history="1">
+      <w:hyperlink w:anchor="_Toc243151182" w:history="1">
         <w:r>
           <w:rPr>
             <w:rStyle w:val="Hipervnculo"/>
@@ -3268,7 +3268,7 @@
             <w:noProof/>
             <w:webHidden/>
           </w:rPr>
-          <w:instrText xml:space="preserve"> PAGEREF _Toc243143964 \h </w:instrText>
+          <w:instrText xml:space="preserve"> PAGEREF _Toc243151182 \h </w:instrText>
         </w:r>
         <w:r>
           <w:rPr>
@@ -3312,7 +3312,7 @@
           <w14:ligatures w14:val="standardContextual"/>
         </w:rPr>
       </w:pPr>
-      <w:hyperlink w:anchor="_Toc243143965" w:history="1">
+      <w:hyperlink w:anchor="_Toc243151183" w:history="1">
         <w:r>
           <w:rPr>
             <w:rStyle w:val="Hipervnculo"/>
@@ -3339,7 +3339,7 @@
             <w:noProof/>
             <w:webHidden/>
           </w:rPr>
-          <w:instrText xml:space="preserve"> PAGEREF _Toc243143965 \h </w:instrText>
+          <w:instrText xml:space="preserve"> PAGEREF _Toc243151183 \h </w:instrText>
         </w:r>
         <w:r>
           <w:rPr>
@@ -3383,7 +3383,7 @@
           <w14:ligatures w14:val="standardContextual"/>
         </w:rPr>
       </w:pPr>
-      <w:hyperlink w:anchor="_Toc243143966" w:history="1">
+      <w:hyperlink w:anchor="_Toc243151184" w:history="1">
         <w:r>
           <w:rPr>
             <w:rStyle w:val="Hipervnculo"/>
@@ -3410,7 +3410,7 @@
             <w:noProof/>
             <w:webHidden/>
           </w:rPr>
-          <w:instrText xml:space="preserve"> PAGEREF _Toc243143966 \h </w:instrText>
+          <w:instrText xml:space="preserve"> PAGEREF _Toc243151184 \h </w:instrText>
         </w:r>
         <w:r>
           <w:rPr>
@@ -3454,7 +3454,7 @@
           <w14:ligatures w14:val="standardContextual"/>
         </w:rPr>
       </w:pPr>
-      <w:hyperlink w:anchor="_Toc243143967" w:history="1">
+      <w:hyperlink w:anchor="_Toc243151185" w:history="1">
         <w:r>
           <w:rPr>
             <w:rStyle w:val="Hipervnculo"/>
@@ -3481,7 +3481,7 @@
             <w:noProof/>
             <w:webHidden/>
           </w:rPr>
-          <w:instrText xml:space="preserve"> PAGEREF _Toc243143967 \h </w:instrText>
+          <w:instrText xml:space="preserve"> PAGEREF _Toc243151185 \h </w:instrText>
         </w:r>
         <w:r>
           <w:rPr>
@@ -3525,7 +3525,7 @@
           <w14:ligatures w14:val="standardContextual"/>
         </w:rPr>
       </w:pPr>
-      <w:hyperlink w:anchor="_Toc243143968" w:history="1">
+      <w:hyperlink w:anchor="_Toc243151186" w:history="1">
         <w:r>
           <w:rPr>
             <w:rStyle w:val="Hipervnculo"/>
@@ -3552,7 +3552,7 @@
             <w:noProof/>
             <w:webHidden/>
           </w:rPr>
-          <w:instrText xml:space="preserve"> PAGEREF _Toc243143968 \h </w:instrText>
+          <w:instrText xml:space="preserve"> PAGEREF _Toc243151186 \h </w:instrText>
         </w:r>
         <w:r>
           <w:rPr>
@@ -3596,7 +3596,7 @@
           <w14:ligatures w14:val="standardContextual"/>
         </w:rPr>
       </w:pPr>
-      <w:hyperlink w:anchor="_Toc243143969" w:history="1">
+      <w:hyperlink w:anchor="_Toc243151187" w:history="1">
         <w:r>
           <w:rPr>
             <w:rStyle w:val="Hipervnculo"/>
@@ -3623,7 +3623,7 @@
             <w:noProof/>
             <w:webHidden/>
           </w:rPr>
-          <w:instrText xml:space="preserve"> PAGEREF _Toc243143969 \h </w:instrText>
+          <w:instrText xml:space="preserve"> PAGEREF _Toc243151187 \h </w:instrText>
         </w:r>
         <w:r>
           <w:rPr>
@@ -3667,7 +3667,7 @@
           <w14:ligatures w14:val="standardContextual"/>
         </w:rPr>
       </w:pPr>
-      <w:hyperlink w:anchor="_Toc243143970" w:history="1">
+      <w:hyperlink w:anchor="_Toc243151188" w:history="1">
         <w:r>
           <w:rPr>
             <w:rStyle w:val="Hipervnculo"/>
@@ -3694,7 +3694,7 @@
             <w:noProof/>
             <w:webHidden/>
           </w:rPr>
-          <w:instrText xml:space="preserve"> PAGEREF _Toc243143970 \h </w:instrText>
+          <w:instrText xml:space="preserve"> PAGEREF _Toc243151188 \h </w:instrText>
         </w:r>
         <w:r>
           <w:rPr>
@@ -3738,7 +3738,7 @@
           <w14:ligatures w14:val="standardContextual"/>
         </w:rPr>
       </w:pPr>
-      <w:hyperlink w:anchor="_Toc243143971" w:history="1">
+      <w:hyperlink w:anchor="_Toc243151189" w:history="1">
         <w:r>
           <w:rPr>
             <w:rStyle w:val="Hipervnculo"/>
@@ -3765,7 +3765,7 @@
             <w:noProof/>
             <w:webHidden/>
           </w:rPr>
-          <w:instrText xml:space="preserve"> PAGEREF _Toc243143971 \h </w:instrText>
+          <w:instrText xml:space="preserve"> PAGEREF _Toc243151189 \h </w:instrText>
         </w:r>
         <w:r>
           <w:rPr>
@@ -3809,7 +3809,7 @@
           <w14:ligatures w14:val="standardContextual"/>
         </w:rPr>
       </w:pPr>
-      <w:hyperlink w:anchor="_Toc243143972" w:history="1">
+      <w:hyperlink w:anchor="_Toc243151190" w:history="1">
         <w:r>
           <w:rPr>
             <w:rStyle w:val="Hipervnculo"/>
@@ -3836,7 +3836,7 @@
             <w:noProof/>
             <w:webHidden/>
           </w:rPr>
-          <w:instrText xml:space="preserve"> PAGEREF _Toc243143972 \h </w:instrText>
+          <w:instrText xml:space="preserve"> PAGEREF _Toc243151190 \h </w:instrText>
         </w:r>
         <w:r>
           <w:rPr>
@@ -3880,7 +3880,7 @@
           <w14:ligatures w14:val="standardContextual"/>
         </w:rPr>
       </w:pPr>
-      <w:hyperlink w:anchor="_Toc243143973" w:history="1">
+      <w:hyperlink w:anchor="_Toc243151191" w:history="1">
         <w:r>
           <w:rPr>
             <w:rStyle w:val="Hipervnculo"/>
@@ -3907,7 +3907,7 @@
             <w:noProof/>
             <w:webHidden/>
           </w:rPr>
-          <w:instrText xml:space="preserve"> PAGEREF _Toc243143973 \h </w:instrText>
+          <w:instrText xml:space="preserve"> PAGEREF _Toc243151191 \h </w:instrText>
         </w:r>
         <w:r>
           <w:rPr>
@@ -3951,7 +3951,7 @@
           <w14:ligatures w14:val="standardContextual"/>
         </w:rPr>
       </w:pPr>
-      <w:hyperlink w:anchor="_Toc243143974" w:history="1">
+      <w:hyperlink w:anchor="_Toc243151192" w:history="1">
         <w:r>
           <w:rPr>
             <w:rStyle w:val="Hipervnculo"/>
@@ -3978,7 +3978,7 @@
             <w:noProof/>
             <w:webHidden/>
           </w:rPr>
-          <w:instrText xml:space="preserve"> PAGEREF _Toc243143974 \h </w:instrText>
+          <w:instrText xml:space="preserve"> PAGEREF _Toc243151192 \h </w:instrText>
         </w:r>
         <w:r>
           <w:rPr>
@@ -4022,7 +4022,7 @@
           <w14:ligatures w14:val="standardContextual"/>
         </w:rPr>
       </w:pPr>
-      <w:hyperlink w:anchor="_Toc243143975" w:history="1">
+      <w:hyperlink w:anchor="_Toc243151193" w:history="1">
         <w:r>
           <w:rPr>
             <w:rStyle w:val="Hipervnculo"/>
@@ -4049,7 +4049,7 @@
             <w:noProof/>
             <w:webHidden/>
           </w:rPr>
-          <w:instrText xml:space="preserve"> PAGEREF _Toc243143975 \h </w:instrText>
+          <w:instrText xml:space="preserve"> PAGEREF _Toc243151193 \h </w:instrText>
         </w:r>
         <w:r>
           <w:rPr>
@@ -4093,7 +4093,7 @@
           <w14:ligatures w14:val="standardContextual"/>
         </w:rPr>
       </w:pPr>
-      <w:hyperlink w:anchor="_Toc243143976" w:history="1">
+      <w:hyperlink w:anchor="_Toc243151194" w:history="1">
         <w:r>
           <w:rPr>
             <w:rStyle w:val="Hipervnculo"/>
@@ -4120,7 +4120,7 @@
             <w:noProof/>
             <w:webHidden/>
           </w:rPr>
-          <w:instrText xml:space="preserve"> PAGEREF _Toc243143976 \h </w:instrText>
+          <w:instrText xml:space="preserve"> PAGEREF _Toc243151194 \h </w:instrText>
         </w:r>
         <w:r>
           <w:rPr>
@@ -4326,7 +4326,7 @@
         <w:spacing w:before="400" w:after="200"/>
         <w:jc w:val="center"/>
       </w:pPr>
-      <w:bookmarkStart w:id="3" w:name="_Toc243143923"/>
+      <w:bookmarkStart w:id="3" w:name="_Toc243151141"/>
       <w:r>
         <w:lastRenderedPageBreak/>
         <w:t>Resumen</w:t>
@@ -4366,7 +4366,7 @@
         <w:spacing w:before="400" w:after="200"/>
         <w:jc w:val="center"/>
       </w:pPr>
-      <w:bookmarkStart w:id="5" w:name="_Toc243143924"/>
+      <w:bookmarkStart w:id="5" w:name="_Toc243151142"/>
       <w:r>
         <w:lastRenderedPageBreak/>
         <w:t>Capítulo 1 - Introducción</w:t>
@@ -4380,7 +4380,7 @@
         <w:spacing w:before="280" w:after="120"/>
       </w:pPr>
       <w:bookmarkStart w:id="6" w:name="_a0cvv8ir0wbh" w:colFirst="0" w:colLast="0"/>
-      <w:bookmarkStart w:id="7" w:name="_Toc243143925"/>
+      <w:bookmarkStart w:id="7" w:name="_Toc243151143"/>
       <w:bookmarkEnd w:id="6"/>
       <w:r>
         <w:t>1.1 Identificación y Planteamiento del Problema</w:t>
@@ -4435,7 +4435,7 @@
         <w:spacing w:before="280" w:after="120"/>
       </w:pPr>
       <w:bookmarkStart w:id="8" w:name="_9ovq9tfge2xf" w:colFirst="0" w:colLast="0"/>
-      <w:bookmarkStart w:id="9" w:name="_Toc243143926"/>
+      <w:bookmarkStart w:id="9" w:name="_Toc243151144"/>
       <w:bookmarkEnd w:id="8"/>
       <w:r>
         <w:t>1.2 Pregunta de Investigación</w:t>
@@ -4524,7 +4524,7 @@
         <w:spacing w:before="280" w:after="120"/>
       </w:pPr>
       <w:bookmarkStart w:id="10" w:name="_wlqqiwfxq7xz" w:colFirst="0" w:colLast="0"/>
-      <w:bookmarkStart w:id="11" w:name="_Toc243143927"/>
+      <w:bookmarkStart w:id="11" w:name="_Toc243151145"/>
       <w:bookmarkEnd w:id="10"/>
       <w:r>
         <w:t>1.3 Hipótesis de Investigación</w:t>
@@ -4549,7 +4549,7 @@
         <w:jc w:val="both"/>
       </w:pPr>
       <w:bookmarkStart w:id="12" w:name="_67xtz98jj70r" w:colFirst="0" w:colLast="0"/>
-      <w:bookmarkStart w:id="13" w:name="_Toc243143928"/>
+      <w:bookmarkStart w:id="13" w:name="_Toc243151146"/>
       <w:bookmarkEnd w:id="12"/>
       <w:r>
         <w:t>Hipótesis 1  Calidad de respuesta con RAG</w:t>
@@ -4574,7 +4574,7 @@
         <w:jc w:val="both"/>
       </w:pPr>
       <w:bookmarkStart w:id="14" w:name="_w1dmls6wpuis" w:colFirst="0" w:colLast="0"/>
-      <w:bookmarkStart w:id="15" w:name="_Toc243143929"/>
+      <w:bookmarkStart w:id="15" w:name="_Toc243151147"/>
       <w:bookmarkEnd w:id="14"/>
       <w:r>
         <w:t>Hipótesis 2  Eficiencia de costos a escala</w:t>
@@ -4599,7 +4599,7 @@
         <w:jc w:val="both"/>
       </w:pPr>
       <w:bookmarkStart w:id="16" w:name="_ozra8bxztd4j" w:colFirst="0" w:colLast="0"/>
-      <w:bookmarkStart w:id="17" w:name="_Toc243143930"/>
+      <w:bookmarkStart w:id="17" w:name="_Toc243151148"/>
       <w:bookmarkEnd w:id="16"/>
       <w:r>
         <w:t>Hipótesis 3  Índice compuesto costo-calidad-latencia</w:t>
@@ -4656,7 +4656,7 @@
         <w:spacing w:before="280" w:after="120"/>
       </w:pPr>
       <w:bookmarkStart w:id="18" w:name="_mugszh5fmbq5" w:colFirst="0" w:colLast="0"/>
-      <w:bookmarkStart w:id="19" w:name="_Toc243143931"/>
+      <w:bookmarkStart w:id="19" w:name="_Toc243151149"/>
       <w:bookmarkEnd w:id="18"/>
       <w:r>
         <w:t>1.4 Objetivos de la Investigación</w:t>
@@ -4671,7 +4671,7 @@
         <w:jc w:val="both"/>
       </w:pPr>
       <w:bookmarkStart w:id="20" w:name="_dfkjpqsdst84" w:colFirst="0" w:colLast="0"/>
-      <w:bookmarkStart w:id="21" w:name="_Toc243143932"/>
+      <w:bookmarkStart w:id="21" w:name="_Toc243151150"/>
       <w:bookmarkEnd w:id="20"/>
       <w:r>
         <w:t>1.4.1 Objetivo General</w:t>
@@ -4696,7 +4696,7 @@
         <w:jc w:val="both"/>
       </w:pPr>
       <w:bookmarkStart w:id="22" w:name="_q76px3yw8zx7" w:colFirst="0" w:colLast="0"/>
-      <w:bookmarkStart w:id="23" w:name="_Toc243143933"/>
+      <w:bookmarkStart w:id="23" w:name="_Toc243151151"/>
       <w:bookmarkEnd w:id="22"/>
       <w:r>
         <w:t>1.4.2 Objetivos Específicos</w:t>
@@ -4750,7 +4750,7 @@
         <w:spacing w:before="280" w:after="120"/>
       </w:pPr>
       <w:bookmarkStart w:id="24" w:name="_qi2j9ew9n21q" w:colFirst="0" w:colLast="0"/>
-      <w:bookmarkStart w:id="25" w:name="_Toc243143934"/>
+      <w:bookmarkStart w:id="25" w:name="_Toc243151152"/>
       <w:bookmarkEnd w:id="24"/>
       <w:r>
         <w:t>1.5 Justificación del Tema y Tipo de Trabajo</w:t>
@@ -4864,7 +4864,7 @@
         <w:spacing w:before="280" w:after="120"/>
       </w:pPr>
       <w:bookmarkStart w:id="26" w:name="_j7jawdn9aaox" w:colFirst="0" w:colLast="0"/>
-      <w:bookmarkStart w:id="27" w:name="_Toc243143935"/>
+      <w:bookmarkStart w:id="27" w:name="_Toc243151153"/>
       <w:bookmarkEnd w:id="26"/>
       <w:r>
         <w:t>1.6 Estructura General de la Tesis</w:t>
@@ -4963,7 +4963,7 @@
         <w:jc w:val="center"/>
       </w:pPr>
       <w:bookmarkStart w:id="28" w:name="_sylgmgf7mrz8" w:colFirst="0" w:colLast="0"/>
-      <w:bookmarkStart w:id="29" w:name="_Toc243143936"/>
+      <w:bookmarkStart w:id="29" w:name="_Toc243151154"/>
       <w:bookmarkEnd w:id="28"/>
       <w:r>
         <w:lastRenderedPageBreak/>
@@ -4978,7 +4978,7 @@
         <w:spacing w:before="280" w:after="120"/>
       </w:pPr>
       <w:bookmarkStart w:id="30" w:name="_cmd6k582zx0a" w:colFirst="0" w:colLast="0"/>
-      <w:bookmarkStart w:id="31" w:name="_Toc243143937"/>
+      <w:bookmarkStart w:id="31" w:name="_Toc243151155"/>
       <w:bookmarkEnd w:id="30"/>
       <w:r>
         <w:t>2.1 Modelos de Lenguaje de Gran Escala</w:t>
@@ -5042,7 +5042,7 @@
         <w:spacing w:before="280" w:after="120"/>
       </w:pPr>
       <w:bookmarkStart w:id="32" w:name="_en61jvdiq65f" w:colFirst="0" w:colLast="0"/>
-      <w:bookmarkStart w:id="33" w:name="_Toc243143938"/>
+      <w:bookmarkStart w:id="33" w:name="_Toc243151156"/>
       <w:bookmarkEnd w:id="32"/>
       <w:r>
         <w:t>2.2 Recuperación Aumentada con Generación</w:t>
@@ -5094,7 +5094,7 @@
         <w:spacing w:before="280" w:after="120"/>
       </w:pPr>
       <w:bookmarkStart w:id="34" w:name="_xiy6olpx7omr" w:colFirst="0" w:colLast="0"/>
-      <w:bookmarkStart w:id="35" w:name="_Toc243143939"/>
+      <w:bookmarkStart w:id="35" w:name="_Toc243151157"/>
       <w:bookmarkEnd w:id="34"/>
       <w:r>
         <w:t>2.3 Métricas de Evaluación en NLP</w:t>
@@ -5178,7 +5178,7 @@
         <w:spacing w:before="280" w:after="120"/>
       </w:pPr>
       <w:bookmarkStart w:id="36" w:name="_esy3ul8xth1b" w:colFirst="0" w:colLast="0"/>
-      <w:bookmarkStart w:id="37" w:name="_Toc243143940"/>
+      <w:bookmarkStart w:id="37" w:name="_Toc243151158"/>
       <w:bookmarkEnd w:id="36"/>
       <w:r>
         <w:t>2.4 Procesamiento reproducible de datos textuales</w:t>
@@ -5218,7 +5218,7 @@
         <w:pStyle w:val="Ttulo2"/>
       </w:pPr>
       <w:bookmarkStart w:id="38" w:name="_jrll2q5g0luc" w:colFirst="0" w:colLast="0"/>
-      <w:bookmarkStart w:id="39" w:name="_Toc243143941"/>
+      <w:bookmarkStart w:id="39" w:name="_Toc243151159"/>
       <w:bookmarkEnd w:id="38"/>
       <w:r>
         <w:t>2.5 Estado del Arte</w:t>
@@ -5280,7 +5280,7 @@
         <w:pStyle w:val="Ttulo2"/>
         <w:spacing w:before="280" w:after="120"/>
       </w:pPr>
-      <w:bookmarkStart w:id="40" w:name="_Toc243143942"/>
+      <w:bookmarkStart w:id="40" w:name="_Toc243151160"/>
       <w:r>
         <w:t>2.6 Síntesis crítica y vacío identificado</w:t>
       </w:r>
@@ -5317,7 +5317,7 @@
         <w:spacing w:before="400" w:after="200"/>
         <w:jc w:val="center"/>
       </w:pPr>
-      <w:bookmarkStart w:id="42" w:name="_Toc243143943"/>
+      <w:bookmarkStart w:id="42" w:name="_Toc243151161"/>
       <w:r>
         <w:lastRenderedPageBreak/>
         <w:t>Capítulo 3 - Metodología de la Investigación</w:t>
@@ -5335,7 +5335,7 @@
         <w:pStyle w:val="Ttulo2"/>
         <w:spacing w:before="280" w:after="120"/>
       </w:pPr>
-      <w:bookmarkStart w:id="43" w:name="_Toc243143944"/>
+      <w:bookmarkStart w:id="43" w:name="_Toc243151162"/>
       <w:r>
         <w:t>3.1 Paradigma y enfoque metodológico</w:t>
       </w:r>
@@ -5355,7 +5355,7 @@
         <w:pStyle w:val="Ttulo2"/>
         <w:spacing w:before="280" w:after="120"/>
       </w:pPr>
-      <w:bookmarkStart w:id="44" w:name="_Toc243143945"/>
+      <w:bookmarkStart w:id="44" w:name="_Toc243151163"/>
       <w:r>
         <w:t>3.2 Diseño de la investigación</w:t>
       </w:r>
@@ -5384,7 +5384,7 @@
         <w:pStyle w:val="Ttulo2"/>
         <w:spacing w:before="280" w:after="120"/>
       </w:pPr>
-      <w:bookmarkStart w:id="45" w:name="_Toc243143946"/>
+      <w:bookmarkStart w:id="45" w:name="_Toc243151164"/>
       <w:r>
         <w:t>3.3 Variables e instrumentos de medición</w:t>
       </w:r>
@@ -5441,7 +5441,7 @@
         <w:pStyle w:val="Ttulo2"/>
         <w:spacing w:before="280" w:after="120"/>
       </w:pPr>
-      <w:bookmarkStart w:id="46" w:name="_Toc243143947"/>
+      <w:bookmarkStart w:id="46" w:name="_Toc243151165"/>
       <w:r>
         <w:t>3.4 Dataset y corpus de datos</w:t>
       </w:r>
@@ -5470,7 +5470,7 @@
         <w:pStyle w:val="Ttulo2"/>
         <w:spacing w:before="280" w:after="120"/>
       </w:pPr>
-      <w:bookmarkStart w:id="47" w:name="_Toc243143948"/>
+      <w:bookmarkStart w:id="47" w:name="_Toc243151166"/>
       <w:r>
         <w:t>3.5 Procedimiento experimental</w:t>
       </w:r>
@@ -5535,7 +5535,7 @@
         <w:pStyle w:val="Ttulo2"/>
         <w:spacing w:before="280" w:after="120"/>
       </w:pPr>
-      <w:bookmarkStart w:id="48" w:name="_Toc243143949"/>
+      <w:bookmarkStart w:id="48" w:name="_Toc243151167"/>
       <w:r>
         <w:lastRenderedPageBreak/>
         <w:t>3.6 Alcance y controles del piloto RAG</w:t>
@@ -5565,7 +5565,7 @@
         <w:pStyle w:val="Ttulo2"/>
         <w:spacing w:before="280" w:after="120"/>
       </w:pPr>
-      <w:bookmarkStart w:id="49" w:name="_Toc243143950"/>
+      <w:bookmarkStart w:id="49" w:name="_Toc243151168"/>
       <w:r>
         <w:t>3.7 Modelo de costos y fuentes</w:t>
       </w:r>
@@ -5594,7 +5594,7 @@
         <w:pStyle w:val="Ttulo2"/>
       </w:pPr>
       <w:bookmarkStart w:id="50" w:name="_t01y384neuv8" w:colFirst="0" w:colLast="0"/>
-      <w:bookmarkStart w:id="51" w:name="_Toc243143951"/>
+      <w:bookmarkStart w:id="51" w:name="_Toc243151169"/>
       <w:bookmarkEnd w:id="50"/>
       <w:r>
         <w:t>3.8 Ampliación del experimento y evaluación humana</w:t>
@@ -5635,7 +5635,7 @@
         <w:spacing w:before="400" w:after="200"/>
         <w:jc w:val="center"/>
       </w:pPr>
-      <w:bookmarkStart w:id="52" w:name="_Toc243143952"/>
+      <w:bookmarkStart w:id="52" w:name="_Toc243151170"/>
       <w:r>
         <w:lastRenderedPageBreak/>
         <w:t>Capítulo 4 - Diseño del Framework</w:t>
@@ -5653,7 +5653,7 @@
         <w:pStyle w:val="Ttulo2"/>
         <w:spacing w:before="280" w:after="120"/>
       </w:pPr>
-      <w:bookmarkStart w:id="53" w:name="_Toc243143953"/>
+      <w:bookmarkStart w:id="53" w:name="_Toc243151171"/>
       <w:r>
         <w:t>4.1 Arquitectura implementada</w:t>
       </w:r>
@@ -5673,7 +5673,7 @@
         <w:pStyle w:val="Ttulo2"/>
         <w:spacing w:before="280" w:after="120"/>
       </w:pPr>
-      <w:bookmarkStart w:id="54" w:name="_Toc243143954"/>
+      <w:bookmarkStart w:id="54" w:name="_Toc243151172"/>
       <w:r>
         <w:t>4.2 Recuperación vectorial</w:t>
       </w:r>
@@ -5693,7 +5693,7 @@
         <w:pStyle w:val="Ttulo2"/>
         <w:spacing w:before="280" w:after="120"/>
       </w:pPr>
-      <w:bookmarkStart w:id="55" w:name="_Toc243143955"/>
+      <w:bookmarkStart w:id="55" w:name="_Toc243151173"/>
       <w:r>
         <w:t>4.3 Control de contaminación</w:t>
       </w:r>
@@ -5713,7 +5713,7 @@
         <w:pStyle w:val="Ttulo2"/>
         <w:spacing w:before="280" w:after="120"/>
       </w:pPr>
-      <w:bookmarkStart w:id="56" w:name="_Toc243143956"/>
+      <w:bookmarkStart w:id="56" w:name="_Toc243151174"/>
       <w:r>
         <w:t>4.4 Estrategia multilingüe</w:t>
       </w:r>
@@ -5733,7 +5733,7 @@
         <w:pStyle w:val="Ttulo2"/>
         <w:spacing w:before="280" w:after="120"/>
       </w:pPr>
-      <w:bookmarkStart w:id="57" w:name="_Toc243143957"/>
+      <w:bookmarkStart w:id="57" w:name="_Toc243151175"/>
       <w:r>
         <w:lastRenderedPageBreak/>
         <w:t>4.5 Diseño de la medición de costos</w:t>
@@ -6249,7 +6249,7 @@
         <w:jc w:val="center"/>
       </w:pPr>
       <w:bookmarkStart w:id="58" w:name="_cp5g65h0480f" w:colFirst="0" w:colLast="0"/>
-      <w:bookmarkStart w:id="59" w:name="_Toc243143958"/>
+      <w:bookmarkStart w:id="59" w:name="_Toc243151176"/>
       <w:bookmarkEnd w:id="58"/>
       <w:r>
         <w:lastRenderedPageBreak/>
@@ -6268,7 +6268,7 @@
         <w:pStyle w:val="Ttulo2"/>
         <w:spacing w:before="280" w:after="120"/>
       </w:pPr>
-      <w:bookmarkStart w:id="60" w:name="_Toc243143959"/>
+      <w:bookmarkStart w:id="60" w:name="_Toc243151177"/>
       <w:r>
         <w:t>5.1 Entorno y modelos</w:t>
       </w:r>
@@ -6288,7 +6288,7 @@
         <w:pStyle w:val="Ttulo2"/>
         <w:spacing w:before="280" w:after="120"/>
       </w:pPr>
-      <w:bookmarkStart w:id="61" w:name="_Toc243143960"/>
+      <w:bookmarkStart w:id="61" w:name="_Toc243151178"/>
       <w:r>
         <w:t>5.2 Construcción del corpus RAG</w:t>
       </w:r>
@@ -6308,7 +6308,7 @@
         <w:pStyle w:val="Ttulo2"/>
         <w:spacing w:before="280" w:after="120"/>
       </w:pPr>
-      <w:bookmarkStart w:id="62" w:name="_Toc243143961"/>
+      <w:bookmarkStart w:id="62" w:name="_Toc243151179"/>
       <w:r>
         <w:t>5.3 Pipeline reproducible</w:t>
       </w:r>
@@ -6329,7 +6329,11 @@
         <w:jc w:val="both"/>
       </w:pPr>
       <w:r>
-        <w:t>La capa de entrada se implementó en esquema_datos.py y acepta archivos CSV, JSON, JSONL y NDJSON. Para las consultas exige un identificador único y el texto; la respuesta de referencia, el idioma, la categoría y la intención son opcionales. Para el conocimiento exige un identificador y el contenido, mientras que el idioma, la categoría, la intención y la fuente son opcionales. Un archivo de mapeo permite asociar columnas propias del usuario con estos campos, y los atributos adicionales se conservan en metadata. Los adaptadores de Bitext mantienen la compatibilidad con el corpus experimental y el comando validar_datos_entrada.py informa la fila y el campo ante un error antes de ejecutar modelos o consumir APIs.</w:t>
+        <w:t xml:space="preserve">La capa de entrada se implementó en esquema_datos.py y acepta archivos CSV, JSON, JSONL y NDJSON. Para las consultas exige un identificador único y el texto; la respuesta de referencia, el idioma, la categoría y la intención son opcionales. Para el conocimiento exige un identificador y el contenido, mientras que el idioma, la categoría, la intención y la fuente son opcionales. Un archivo de mapeo permite asociar columnas propias del usuario con estos campos, y los atributos adicionales se conservan en metadata. Los adaptadores de Bitext mantienen la compatibilidad con el corpus experimental y el comando validar_datos_entrada.py informa la fila y el campo ante un error antes de ejecutar modelos o consumir APIs. El ejecutor ejecutar_datos_propios.py conecta estas estructuras con el recuperador y los clientes de modelos. Antes de una corrida presenta un </w:t>
+      </w:r>
+      <w:r>
+        <w:lastRenderedPageBreak/>
+        <w:t>plan sin cargar modelos ni consumir APIs y exige una confirmación explícita para generar respuestas. Cuando faltan referencias o intenciones, la ejecución continúa y declara como no disponibles las métricas que dependen de esos campos. Además, valida cada checkpoint contra el identificador y el texto de la consulta para evitar la mezcla accidental de datasets.</w:t>
       </w:r>
     </w:p>
     <w:p>
@@ -6338,7 +6342,6 @@
         <w:ind w:left="720" w:hanging="360"/>
       </w:pPr>
       <w:r>
-        <w:lastRenderedPageBreak/>
         <w:t>• comparacion_controlada_rag.csv: comparación principal baseline-RAG.</w:t>
       </w:r>
     </w:p>
@@ -6374,7 +6377,7 @@
         <w:pStyle w:val="Ttulo2"/>
         <w:spacing w:before="280" w:after="120"/>
       </w:pPr>
-      <w:bookmarkStart w:id="63" w:name="_Toc243143962"/>
+      <w:bookmarkStart w:id="63" w:name="_Toc243151180"/>
       <w:r>
         <w:t>5.4 Verificación técnica</w:t>
       </w:r>
@@ -6386,7 +6389,7 @@
         <w:jc w:val="both"/>
       </w:pPr>
       <w:r>
-        <w:t>El smoke test local completó cuatro generaciones de dos consultas en LLaMA y Mistral. La corrida completa produjo 60 de 60 respuestas válidas en RAG y otras 60 de 60 en el baseline controlado. La suite automatizada finalizó con 60 pruebas aprobadas, incluidas siete dedicadas al esquema de entrada. Durante el smoke test, Mistral inventó un canal de correo que no estaba respaldado por el contexto; este caso confirma que RAG reduce el espacio de respuesta, pero no garantiza por sí mismo la ausencia de alucinaciones.</w:t>
+        <w:t>El smoke test local completó cuatro generaciones de dos consultas en LLaMA y Mistral. La corrida completa produjo 60 de 60 respuestas válidas en RAG y otras 60 de 60 en el baseline controlado. La suite automatizada finalizó con 66 pruebas aprobadas, incluidas trece dedicadas al esquema de entrada y su integración con el pipeline. Durante el smoke test, Mistral inventó un canal de correo que no estaba respaldado por el contexto; este caso confirma que RAG reduce el espacio de respuesta, pero no garantiza por sí mismo la ausencia de alucinaciones.</w:t>
       </w:r>
     </w:p>
     <w:p>
@@ -6394,7 +6397,7 @@
         <w:pStyle w:val="Ttulo2"/>
       </w:pPr>
       <w:bookmarkStart w:id="64" w:name="_kjpof9hrgtgt" w:colFirst="0" w:colLast="0"/>
-      <w:bookmarkStart w:id="65" w:name="_Toc243143963"/>
+      <w:bookmarkStart w:id="65" w:name="_Toc243151181"/>
       <w:bookmarkEnd w:id="64"/>
       <w:r>
         <w:t>5.5 Dashboard de resultados</w:t>
@@ -6419,7 +6422,7 @@
         <w:spacing w:before="400" w:after="200"/>
         <w:jc w:val="center"/>
       </w:pPr>
-      <w:bookmarkStart w:id="66" w:name="_Toc243143964"/>
+      <w:bookmarkStart w:id="66" w:name="_Toc243151182"/>
       <w:r>
         <w:lastRenderedPageBreak/>
         <w:t>Capítulo 6 - Experimentación y Resultados</w:t>
@@ -6437,7 +6440,7 @@
         <w:pStyle w:val="Ttulo2"/>
         <w:spacing w:before="280" w:after="120"/>
       </w:pPr>
-      <w:bookmarkStart w:id="67" w:name="_Toc243143965"/>
+      <w:bookmarkStart w:id="67" w:name="_Toc243151183"/>
       <w:r>
         <w:t>6.1 Diseño del piloto controlado</w:t>
       </w:r>
@@ -6457,7 +6460,7 @@
         <w:pStyle w:val="Ttulo2"/>
         <w:spacing w:before="280" w:after="120"/>
       </w:pPr>
-      <w:bookmarkStart w:id="68" w:name="_Toc243143966"/>
+      <w:bookmarkStart w:id="68" w:name="_Toc243151184"/>
       <w:r>
         <w:t>6.2 Rendimiento del recuperador</w:t>
       </w:r>
@@ -6969,7 +6972,7 @@
         <w:pStyle w:val="Ttulo2"/>
         <w:spacing w:before="280" w:after="120"/>
       </w:pPr>
-      <w:bookmarkStart w:id="69" w:name="_Toc243143967"/>
+      <w:bookmarkStart w:id="69" w:name="_Toc243151185"/>
       <w:r>
         <w:t>6.3 Calidad por modelo y condición</w:t>
       </w:r>
@@ -7395,7 +7398,7 @@
         <w:pStyle w:val="Ttulo2"/>
         <w:spacing w:before="280" w:after="120"/>
       </w:pPr>
-      <w:bookmarkStart w:id="70" w:name="_Toc243143968"/>
+      <w:bookmarkStart w:id="70" w:name="_Toc243151186"/>
       <w:r>
         <w:t>6.4 Latencia, tokens y costos</w:t>
       </w:r>
@@ -7945,7 +7948,7 @@
         <w:pStyle w:val="Ttulo2"/>
         <w:spacing w:before="280" w:after="120"/>
       </w:pPr>
-      <w:bookmarkStart w:id="71" w:name="_Toc243143969"/>
+      <w:bookmarkStart w:id="71" w:name="_Toc243151187"/>
       <w:r>
         <w:t>6.5 Aciertos de recuperación y calidad</w:t>
       </w:r>
@@ -8370,7 +8373,7 @@
       <w:pPr>
         <w:pStyle w:val="Ttulo2"/>
       </w:pPr>
-      <w:bookmarkStart w:id="72" w:name="_Toc243143970"/>
+      <w:bookmarkStart w:id="72" w:name="_Toc243151188"/>
       <w:r>
         <w:t>6.6 Discusión de las hipótesis en el piloto</w:t>
       </w:r>
@@ -8408,7 +8411,7 @@
         <w:pStyle w:val="Ttulo2"/>
         <w:spacing w:before="280" w:after="120"/>
       </w:pPr>
-      <w:bookmarkStart w:id="73" w:name="_Toc243143971"/>
+      <w:bookmarkStart w:id="73" w:name="_Toc243151189"/>
       <w:r>
         <w:t>6.7 Limitaciones del piloto</w:t>
       </w:r>
@@ -8483,7 +8486,7 @@
         <w:pStyle w:val="Ttulo2"/>
       </w:pPr>
       <w:bookmarkStart w:id="74" w:name="_xe7dxo5vlxj0" w:colFirst="0" w:colLast="0"/>
-      <w:bookmarkStart w:id="75" w:name="_Toc243143972"/>
+      <w:bookmarkStart w:id="75" w:name="_Toc243151190"/>
       <w:bookmarkEnd w:id="74"/>
       <w:r>
         <w:t>6.8 Experimento ampliado y visualización de resultados</w:t>
@@ -9625,7 +9628,7 @@
         <w:spacing w:before="400" w:after="200"/>
         <w:jc w:val="center"/>
       </w:pPr>
-      <w:bookmarkStart w:id="76" w:name="_Toc243143973"/>
+      <w:bookmarkStart w:id="76" w:name="_Toc243151191"/>
       <w:r>
         <w:lastRenderedPageBreak/>
         <w:t>Conclusiones</w:t>
@@ -9665,7 +9668,7 @@
         <w:spacing w:before="400" w:after="200"/>
         <w:jc w:val="center"/>
       </w:pPr>
-      <w:bookmarkStart w:id="78" w:name="_Toc243143974"/>
+      <w:bookmarkStart w:id="78" w:name="_Toc243151192"/>
       <w:r>
         <w:lastRenderedPageBreak/>
         <w:t>Líneas Futuras de Investigación</w:t>
@@ -9717,7 +9720,7 @@
         <w:spacing w:before="400" w:after="200"/>
         <w:jc w:val="center"/>
       </w:pPr>
-      <w:bookmarkStart w:id="80" w:name="_Toc243143975"/>
+      <w:bookmarkStart w:id="80" w:name="_Toc243151193"/>
       <w:r>
         <w:lastRenderedPageBreak/>
         <w:t>Referencias</w:t>
@@ -10084,7 +10087,7 @@
         <w:jc w:val="center"/>
       </w:pPr>
       <w:bookmarkStart w:id="81" w:name="_1q0j1q3m5z1k" w:colFirst="0" w:colLast="0"/>
-      <w:bookmarkStart w:id="82" w:name="_Toc243143976"/>
+      <w:bookmarkStart w:id="82" w:name="_Toc243151194"/>
       <w:bookmarkEnd w:id="81"/>
       <w:r>
         <w:lastRenderedPageBreak/>

</xml_diff>